<commit_message>
added scheduled workflow and final report updates
</commit_message>
<xml_diff>
--- a/Anzuman_Ara_MLOps_Report.docx
+++ b/Anzuman_Ara_MLOps_Report.docx
@@ -6,6 +6,7 @@
       <w:pPr>
         <w:jc w:val="center"/>
         <w:rPr>
+          <w:rFonts w:ascii="Times New Roman" w:hAnsi="Times New Roman" w:cs="Times New Roman"/>
           <w:b/>
           <w:sz w:val="44"/>
           <w:szCs w:val="44"/>
@@ -13,6 +14,7 @@
       </w:pPr>
       <w:r>
         <w:rPr>
+          <w:rFonts w:ascii="Times New Roman" w:hAnsi="Times New Roman" w:cs="Times New Roman"/>
           <w:b/>
           <w:sz w:val="44"/>
           <w:szCs w:val="44"/>
@@ -24,6 +26,7 @@
       <w:pPr>
         <w:jc w:val="center"/>
         <w:rPr>
+          <w:rFonts w:ascii="Times New Roman" w:hAnsi="Times New Roman" w:cs="Times New Roman"/>
           <w:sz w:val="36"/>
           <w:szCs w:val="36"/>
         </w:rPr>
@@ -33,6 +36,7 @@
       <w:pPr>
         <w:jc w:val="center"/>
         <w:rPr>
+          <w:rFonts w:ascii="Times New Roman" w:hAnsi="Times New Roman" w:cs="Times New Roman"/>
           <w:b/>
           <w:sz w:val="36"/>
           <w:szCs w:val="36"/>
@@ -41,6 +45,7 @@
       <w:proofErr w:type="spellStart"/>
       <w:r>
         <w:rPr>
+          <w:rFonts w:ascii="Times New Roman" w:hAnsi="Times New Roman" w:cs="Times New Roman"/>
           <w:b/>
           <w:sz w:val="36"/>
           <w:szCs w:val="36"/>
@@ -50,78 +55,60 @@
       <w:proofErr w:type="spellEnd"/>
       <w:r>
         <w:rPr>
+          <w:rFonts w:ascii="Times New Roman" w:hAnsi="Times New Roman" w:cs="Times New Roman"/>
           <w:b/>
           <w:sz w:val="36"/>
           <w:szCs w:val="36"/>
         </w:rPr>
-        <w:t xml:space="preserve"> Final Assignment</w:t>
-      </w:r>
-      <w:r>
-        <w:rPr>
+        <w:t xml:space="preserve"> Final Assignment:</w:t>
+      </w:r>
+      <w:r>
+        <w:rPr>
+          <w:rFonts w:ascii="Times New Roman" w:hAnsi="Times New Roman" w:cs="Times New Roman"/>
           <w:b/>
           <w:sz w:val="36"/>
           <w:szCs w:val="36"/>
         </w:rPr>
-        <w:t>:</w:t>
-      </w:r>
-      <w:r>
-        <w:rPr>
+        <w:t xml:space="preserve"> </w:t>
+      </w:r>
+    </w:p>
+    <w:p>
+      <w:pPr>
+        <w:jc w:val="center"/>
+        <w:rPr>
+          <w:rFonts w:ascii="Times New Roman" w:hAnsi="Times New Roman" w:cs="Times New Roman"/>
           <w:b/>
           <w:sz w:val="36"/>
           <w:szCs w:val="36"/>
         </w:rPr>
-        <w:t xml:space="preserve"> </w:t>
-      </w:r>
-    </w:p>
-    <w:p>
-      <w:pPr>
-        <w:jc w:val="center"/>
-        <w:rPr>
+      </w:pPr>
+      <w:r>
+        <w:rPr>
+          <w:rFonts w:ascii="Times New Roman" w:hAnsi="Times New Roman" w:cs="Times New Roman"/>
           <w:b/>
           <w:sz w:val="36"/>
           <w:szCs w:val="36"/>
         </w:rPr>
-      </w:pPr>
-      <w:r>
-        <w:rPr>
+        <w:t>Customer-Churn-</w:t>
+      </w:r>
+      <w:proofErr w:type="spellStart"/>
+      <w:r>
+        <w:rPr>
+          <w:rFonts w:ascii="Times New Roman" w:hAnsi="Times New Roman" w:cs="Times New Roman"/>
           <w:b/>
           <w:sz w:val="36"/>
           <w:szCs w:val="36"/>
         </w:rPr>
-        <w:t>Customer-C</w:t>
-      </w:r>
-      <w:r>
-        <w:rPr>
+        <w:t>MLOps</w:t>
+      </w:r>
+      <w:proofErr w:type="spellEnd"/>
+      <w:r>
+        <w:rPr>
+          <w:rFonts w:ascii="Times New Roman" w:hAnsi="Times New Roman" w:cs="Times New Roman"/>
           <w:b/>
           <w:sz w:val="36"/>
           <w:szCs w:val="36"/>
         </w:rPr>
-        <w:t>h</w:t>
-      </w:r>
-      <w:r>
-        <w:rPr>
-          <w:b/>
-          <w:sz w:val="36"/>
-          <w:szCs w:val="36"/>
-        </w:rPr>
-        <w:t>urn-</w:t>
-      </w:r>
-      <w:proofErr w:type="spellStart"/>
-      <w:r>
-        <w:rPr>
-          <w:b/>
-          <w:sz w:val="36"/>
-          <w:szCs w:val="36"/>
-        </w:rPr>
-        <w:t>MLOps</w:t>
-      </w:r>
-      <w:proofErr w:type="spellEnd"/>
-      <w:r>
-        <w:rPr>
-          <w:b/>
-          <w:sz w:val="36"/>
-          <w:szCs w:val="36"/>
-        </w:rPr>
         <w:t xml:space="preserve"> Pipeline</w:t>
       </w:r>
     </w:p>
@@ -129,6 +116,7 @@
       <w:pPr>
         <w:jc w:val="center"/>
         <w:rPr>
+          <w:rFonts w:ascii="Times New Roman" w:hAnsi="Times New Roman" w:cs="Times New Roman"/>
           <w:sz w:val="40"/>
           <w:szCs w:val="40"/>
         </w:rPr>
@@ -138,6 +126,7 @@
       <w:pPr>
         <w:jc w:val="center"/>
         <w:rPr>
+          <w:rFonts w:ascii="Times New Roman" w:hAnsi="Times New Roman" w:cs="Times New Roman"/>
           <w:sz w:val="40"/>
           <w:szCs w:val="40"/>
         </w:rPr>
@@ -147,6 +136,7 @@
       <w:pPr>
         <w:jc w:val="center"/>
         <w:rPr>
+          <w:rFonts w:ascii="Times New Roman" w:hAnsi="Times New Roman" w:cs="Times New Roman"/>
           <w:b/>
           <w:sz w:val="40"/>
           <w:szCs w:val="40"/>
@@ -154,6 +144,7 @@
       </w:pPr>
       <w:r>
         <w:rPr>
+          <w:rFonts w:ascii="Times New Roman" w:hAnsi="Times New Roman" w:cs="Times New Roman"/>
           <w:b/>
           <w:sz w:val="40"/>
           <w:szCs w:val="40"/>
@@ -163,6 +154,7 @@
       <w:proofErr w:type="spellStart"/>
       <w:r>
         <w:rPr>
+          <w:rFonts w:ascii="Times New Roman" w:hAnsi="Times New Roman" w:cs="Times New Roman"/>
           <w:b/>
           <w:sz w:val="40"/>
           <w:szCs w:val="40"/>
@@ -175,6 +167,7 @@
       <w:pPr>
         <w:jc w:val="center"/>
         <w:rPr>
+          <w:rFonts w:ascii="Times New Roman" w:hAnsi="Times New Roman" w:cs="Times New Roman"/>
           <w:b/>
           <w:sz w:val="40"/>
           <w:szCs w:val="40"/>
@@ -182,6 +175,7 @@
       </w:pPr>
       <w:r>
         <w:rPr>
+          <w:rFonts w:ascii="Times New Roman" w:hAnsi="Times New Roman" w:cs="Times New Roman"/>
           <w:b/>
           <w:sz w:val="40"/>
           <w:szCs w:val="40"/>
@@ -193,6 +187,7 @@
       <w:pPr>
         <w:jc w:val="center"/>
         <w:rPr>
+          <w:rFonts w:ascii="Times New Roman" w:hAnsi="Times New Roman" w:cs="Times New Roman"/>
           <w:sz w:val="40"/>
           <w:szCs w:val="40"/>
         </w:rPr>
@@ -202,6 +197,7 @@
       <w:pPr>
         <w:jc w:val="center"/>
         <w:rPr>
+          <w:rFonts w:ascii="Times New Roman" w:hAnsi="Times New Roman" w:cs="Times New Roman"/>
           <w:sz w:val="40"/>
           <w:szCs w:val="40"/>
         </w:rPr>
@@ -211,6 +207,7 @@
       <w:pPr>
         <w:jc w:val="center"/>
         <w:rPr>
+          <w:rFonts w:ascii="Times New Roman" w:hAnsi="Times New Roman" w:cs="Times New Roman"/>
           <w:b/>
           <w:sz w:val="40"/>
           <w:szCs w:val="40"/>
@@ -218,6 +215,7 @@
       </w:pPr>
       <w:r>
         <w:rPr>
+          <w:rFonts w:ascii="Times New Roman" w:hAnsi="Times New Roman" w:cs="Times New Roman"/>
           <w:b/>
           <w:sz w:val="40"/>
           <w:szCs w:val="40"/>
@@ -226,6 +224,7 @@
       </w:r>
       <w:r>
         <w:rPr>
+          <w:rFonts w:ascii="Times New Roman" w:hAnsi="Times New Roman" w:cs="Times New Roman"/>
           <w:b/>
           <w:sz w:val="40"/>
           <w:szCs w:val="40"/>
@@ -707,26 +706,11 @@
           <w:b/>
           <w:bCs/>
           <w:kern w:val="36"/>
-          <w:sz w:val="48"/>
-          <w:szCs w:val="48"/>
-        </w:rPr>
-      </w:pPr>
-      <w:r>
-        <w:rPr>
-          <w:rFonts w:ascii="Times New Roman" w:eastAsia="Times New Roman" w:hAnsi="Times New Roman" w:cs="Times New Roman"/>
-          <w:b/>
-          <w:bCs/>
-          <w:kern w:val="36"/>
-          <w:sz w:val="48"/>
-          <w:szCs w:val="48"/>
-        </w:rPr>
-        <w:br w:type="page"/>
-      </w:r>
-    </w:p>
-    <w:p>
-      <w:pPr>
-        <w:spacing w:before="100" w:beforeAutospacing="1" w:after="100" w:afterAutospacing="1" w:line="240" w:lineRule="auto"/>
-        <w:outlineLvl w:val="0"/>
+          <w:sz w:val="44"/>
+          <w:szCs w:val="44"/>
+        </w:rPr>
+      </w:pPr>
+      <w:r>
         <w:rPr>
           <w:rFonts w:ascii="Times New Roman" w:eastAsia="Times New Roman" w:hAnsi="Times New Roman" w:cs="Times New Roman"/>
           <w:b/>
@@ -735,7 +719,24 @@
           <w:sz w:val="44"/>
           <w:szCs w:val="44"/>
         </w:rPr>
-      </w:pPr>
+        <w:br w:type="page"/>
+      </w:r>
+    </w:p>
+    <w:p>
+      <w:pPr>
+        <w:spacing w:before="100" w:beforeAutospacing="1" w:after="100" w:afterAutospacing="1" w:line="240" w:lineRule="auto"/>
+        <w:outlineLvl w:val="0"/>
+        <w:rPr>
+          <w:rFonts w:ascii="Times New Roman" w:eastAsia="Times New Roman" w:hAnsi="Times New Roman" w:cs="Times New Roman"/>
+          <w:b/>
+          <w:bCs/>
+          <w:kern w:val="36"/>
+          <w:sz w:val="44"/>
+          <w:szCs w:val="44"/>
+        </w:rPr>
+      </w:pPr>
+      <w:bookmarkStart w:id="0" w:name="_GoBack"/>
+      <w:bookmarkEnd w:id="0"/>
       <w:r>
         <w:rPr>
           <w:rFonts w:ascii="Times New Roman" w:eastAsia="Times New Roman" w:hAnsi="Times New Roman" w:cs="Times New Roman"/>
@@ -1112,6 +1113,7 @@
       </w:r>
       <w:r>
         <w:rPr>
+          <w:rFonts w:ascii="Times New Roman" w:hAnsi="Times New Roman" w:cs="Times New Roman"/>
           <w:sz w:val="24"/>
           <w:szCs w:val="24"/>
         </w:rPr>
@@ -1120,6 +1122,7 @@
       <w:proofErr w:type="spellStart"/>
       <w:r>
         <w:rPr>
+          <w:rFonts w:ascii="Times New Roman" w:hAnsi="Times New Roman" w:cs="Times New Roman"/>
           <w:sz w:val="24"/>
           <w:szCs w:val="24"/>
         </w:rPr>
@@ -1128,6 +1131,7 @@
       <w:proofErr w:type="spellEnd"/>
       <w:r>
         <w:rPr>
+          <w:rFonts w:ascii="Times New Roman" w:hAnsi="Times New Roman" w:cs="Times New Roman"/>
           <w:sz w:val="24"/>
           <w:szCs w:val="24"/>
         </w:rPr>
@@ -2078,337 +2082,7 @@
           <w:sz w:val="24"/>
           <w:szCs w:val="24"/>
         </w:rPr>
-        <w:t>This allows:</w:t>
-      </w:r>
-      <w:r>
-        <w:rPr>
-          <w:rFonts w:ascii="Times New Roman" w:eastAsia="Times New Roman" w:hAnsi="Times New Roman" w:cs="Times New Roman"/>
-          <w:sz w:val="24"/>
-          <w:szCs w:val="24"/>
-        </w:rPr>
-        <w:br/>
-        <w:t>• Traceability of predictions, meaning each prediction can be linked back to the input data that produced it.</w:t>
-      </w:r>
-      <w:r>
-        <w:rPr>
-          <w:rFonts w:ascii="Times New Roman" w:eastAsia="Times New Roman" w:hAnsi="Times New Roman" w:cs="Times New Roman"/>
-          <w:sz w:val="24"/>
-          <w:szCs w:val="24"/>
-        </w:rPr>
-        <w:br/>
-        <w:t>• Detection of anomalies, such as unusual prediction patterns, missing values, or unexpected changes in incoming data.</w:t>
-      </w:r>
-      <w:r>
-        <w:rPr>
-          <w:rFonts w:ascii="Times New Roman" w:eastAsia="Times New Roman" w:hAnsi="Times New Roman" w:cs="Times New Roman"/>
-          <w:sz w:val="24"/>
-          <w:szCs w:val="24"/>
-        </w:rPr>
-        <w:br/>
-        <w:t>• Easier debugging of system behavior, since logs provide a clear record of what happened at each stage of the pipeline.</w:t>
-      </w:r>
-    </w:p>
-    <w:p>
-      <w:pPr>
-        <w:spacing w:before="100" w:beforeAutospacing="1" w:after="100" w:afterAutospacing="1" w:line="240" w:lineRule="auto"/>
-        <w:rPr>
-          <w:rFonts w:ascii="Times New Roman" w:eastAsia="Times New Roman" w:hAnsi="Times New Roman" w:cs="Times New Roman"/>
-          <w:sz w:val="24"/>
-          <w:szCs w:val="24"/>
-        </w:rPr>
-      </w:pPr>
-      <w:r>
-        <w:rPr>
-          <w:rFonts w:ascii="Times New Roman" w:eastAsia="Times New Roman" w:hAnsi="Times New Roman" w:cs="Times New Roman"/>
-          <w:sz w:val="24"/>
-          <w:szCs w:val="24"/>
-        </w:rPr>
-        <w:t>Future improvements:</w:t>
-      </w:r>
-      <w:r>
-        <w:rPr>
-          <w:rFonts w:ascii="Times New Roman" w:eastAsia="Times New Roman" w:hAnsi="Times New Roman" w:cs="Times New Roman"/>
-          <w:sz w:val="24"/>
-          <w:szCs w:val="24"/>
-        </w:rPr>
-        <w:br/>
-        <w:t>• Data drift detection can be added to identify changes in the pattern or distribution of incoming data over time.</w:t>
-      </w:r>
-      <w:r>
-        <w:rPr>
-          <w:rFonts w:ascii="Times New Roman" w:eastAsia="Times New Roman" w:hAnsi="Times New Roman" w:cs="Times New Roman"/>
-          <w:sz w:val="24"/>
-          <w:szCs w:val="24"/>
-        </w:rPr>
-        <w:br/>
-        <w:t>• Performance degradation alerts can be introduced to notify users when the model’s accuracy or reliability starts to decline.</w:t>
-      </w:r>
-    </w:p>
-    <w:p>
-      <w:pPr>
-        <w:spacing w:after="0" w:line="240" w:lineRule="auto"/>
-        <w:rPr>
-          <w:rFonts w:ascii="Times New Roman" w:eastAsia="Times New Roman" w:hAnsi="Times New Roman" w:cs="Times New Roman"/>
-          <w:sz w:val="24"/>
-          <w:szCs w:val="24"/>
-        </w:rPr>
-      </w:pPr>
-    </w:p>
-    <w:p>
-      <w:pPr>
-        <w:spacing w:before="100" w:beforeAutospacing="1" w:after="100" w:afterAutospacing="1" w:line="240" w:lineRule="auto"/>
-        <w:outlineLvl w:val="1"/>
-        <w:rPr>
-          <w:rFonts w:ascii="Times New Roman" w:eastAsia="Times New Roman" w:hAnsi="Times New Roman" w:cs="Times New Roman"/>
-          <w:b/>
-          <w:bCs/>
-          <w:sz w:val="36"/>
-          <w:szCs w:val="36"/>
-        </w:rPr>
-      </w:pPr>
-      <w:r>
-        <w:rPr>
-          <w:rFonts w:ascii="Times New Roman" w:eastAsia="Times New Roman" w:hAnsi="Times New Roman" w:cs="Times New Roman"/>
-          <w:b/>
-          <w:bCs/>
-          <w:sz w:val="36"/>
-          <w:szCs w:val="36"/>
-        </w:rPr>
-        <w:t>4.3 Versioning</w:t>
-      </w:r>
-    </w:p>
-    <w:p>
-      <w:pPr>
-        <w:spacing w:before="100" w:beforeAutospacing="1" w:after="100" w:afterAutospacing="1" w:line="240" w:lineRule="auto"/>
-        <w:rPr>
-          <w:rFonts w:ascii="Times New Roman" w:eastAsia="Times New Roman" w:hAnsi="Times New Roman" w:cs="Times New Roman"/>
-          <w:sz w:val="24"/>
-          <w:szCs w:val="24"/>
-        </w:rPr>
-      </w:pPr>
-      <w:r>
-        <w:rPr>
-          <w:rFonts w:ascii="Times New Roman" w:eastAsia="Times New Roman" w:hAnsi="Times New Roman" w:cs="Times New Roman"/>
-          <w:sz w:val="24"/>
-          <w:szCs w:val="24"/>
-        </w:rPr>
-        <w:t>Artifacts are versioned implicitly through file storage:</w:t>
-      </w:r>
-      <w:r>
-        <w:rPr>
-          <w:rFonts w:ascii="Times New Roman" w:eastAsia="Times New Roman" w:hAnsi="Times New Roman" w:cs="Times New Roman"/>
-          <w:sz w:val="24"/>
-          <w:szCs w:val="24"/>
-        </w:rPr>
-        <w:br/>
-        <w:t>• Datasets are stored in separate files, which helps preserve the original historical data and any updated versions over time.</w:t>
-      </w:r>
-      <w:r>
-        <w:rPr>
-          <w:rFonts w:ascii="Times New Roman" w:eastAsia="Times New Roman" w:hAnsi="Times New Roman" w:cs="Times New Roman"/>
-          <w:sz w:val="24"/>
-          <w:szCs w:val="24"/>
-        </w:rPr>
-        <w:br/>
-        <w:t>• Processed data files are saved after each transformation step, making it easier to track changes made during preprocessing.</w:t>
-      </w:r>
-      <w:r>
-        <w:rPr>
-          <w:rFonts w:ascii="Times New Roman" w:eastAsia="Times New Roman" w:hAnsi="Times New Roman" w:cs="Times New Roman"/>
-          <w:sz w:val="24"/>
-          <w:szCs w:val="24"/>
-        </w:rPr>
-        <w:br/>
-        <w:t>• Model files are stored whenever a new model is trained, allowing different trained versions to be kept for comparison or reuse.</w:t>
-      </w:r>
-      <w:r>
-        <w:rPr>
-          <w:rFonts w:ascii="Times New Roman" w:eastAsia="Times New Roman" w:hAnsi="Times New Roman" w:cs="Times New Roman"/>
-          <w:sz w:val="24"/>
-          <w:szCs w:val="24"/>
-        </w:rPr>
-        <w:br/>
-        <w:t>• Logs are also saved as records of system activity, helping track updates, predictions, and system behavior over time.</w:t>
-      </w:r>
-    </w:p>
-    <w:p>
-      <w:pPr>
-        <w:spacing w:before="100" w:beforeAutospacing="1" w:after="100" w:afterAutospacing="1" w:line="240" w:lineRule="auto"/>
-        <w:rPr>
-          <w:rFonts w:ascii="Times New Roman" w:eastAsia="Times New Roman" w:hAnsi="Times New Roman" w:cs="Times New Roman"/>
-          <w:sz w:val="24"/>
-          <w:szCs w:val="24"/>
-        </w:rPr>
-      </w:pPr>
-      <w:r>
-        <w:rPr>
-          <w:rFonts w:ascii="Times New Roman" w:eastAsia="Times New Roman" w:hAnsi="Times New Roman" w:cs="Times New Roman"/>
-          <w:sz w:val="24"/>
-          <w:szCs w:val="24"/>
-        </w:rPr>
-        <w:t>Versioning supports reproducibility by making it possible to repeat the same workflow and obtain consistent results. It also allows rollback to previous versions of data or models if errors occur or if a newer version performs worse.</w:t>
-      </w:r>
-    </w:p>
-    <w:p>
-      <w:pPr>
-        <w:spacing w:after="0" w:line="240" w:lineRule="auto"/>
-        <w:rPr>
-          <w:rFonts w:ascii="Times New Roman" w:eastAsia="Times New Roman" w:hAnsi="Times New Roman" w:cs="Times New Roman"/>
-          <w:sz w:val="24"/>
-          <w:szCs w:val="24"/>
-        </w:rPr>
-      </w:pPr>
-    </w:p>
-    <w:p>
-      <w:pPr>
-        <w:spacing w:before="100" w:beforeAutospacing="1" w:after="100" w:afterAutospacing="1" w:line="240" w:lineRule="auto"/>
-        <w:outlineLvl w:val="0"/>
-        <w:rPr>
-          <w:rFonts w:ascii="Times New Roman" w:eastAsia="Times New Roman" w:hAnsi="Times New Roman" w:cs="Times New Roman"/>
-          <w:b/>
-          <w:bCs/>
-          <w:kern w:val="36"/>
-          <w:sz w:val="48"/>
-          <w:szCs w:val="48"/>
-        </w:rPr>
-      </w:pPr>
-    </w:p>
-    <w:p>
-      <w:pPr>
-        <w:spacing w:before="100" w:beforeAutospacing="1" w:after="100" w:afterAutospacing="1" w:line="240" w:lineRule="auto"/>
-        <w:outlineLvl w:val="0"/>
-        <w:rPr>
-          <w:rFonts w:ascii="Times New Roman" w:eastAsia="Times New Roman" w:hAnsi="Times New Roman" w:cs="Times New Roman"/>
-          <w:b/>
-          <w:bCs/>
-          <w:kern w:val="36"/>
-          <w:sz w:val="44"/>
-          <w:szCs w:val="44"/>
-        </w:rPr>
-      </w:pPr>
-      <w:r>
-        <w:rPr>
-          <w:rFonts w:ascii="Times New Roman" w:eastAsia="Times New Roman" w:hAnsi="Times New Roman" w:cs="Times New Roman"/>
-          <w:b/>
-          <w:bCs/>
-          <w:kern w:val="36"/>
-          <w:sz w:val="44"/>
-          <w:szCs w:val="44"/>
-        </w:rPr>
-        <w:lastRenderedPageBreak/>
-        <w:t>5. Artifact Collection and Storage</w:t>
-      </w:r>
-    </w:p>
-    <w:p>
-      <w:pPr>
-        <w:spacing w:before="100" w:beforeAutospacing="1" w:after="100" w:afterAutospacing="1" w:line="240" w:lineRule="auto"/>
-        <w:rPr>
-          <w:rFonts w:eastAsia="Times New Roman" w:cstheme="minorHAnsi"/>
-          <w:sz w:val="24"/>
-          <w:szCs w:val="24"/>
-        </w:rPr>
-      </w:pPr>
-      <w:r>
-        <w:rPr>
-          <w:rFonts w:ascii="Times New Roman" w:hAnsi="Times New Roman" w:cs="Times New Roman"/>
-          <w:sz w:val="24"/>
-          <w:szCs w:val="24"/>
-        </w:rPr>
-        <w:t>Proper artifact management improves traceability and reproducibility throughout the machine learning lifecycle. By keeping track of datasets, processed files, model versions, and logs, it becomes easier to understand how results were produced and to repeat the same workflow when needed. This is an important requirement in production systems, where reliability, consistency, and the ability to troubleshoot issues are essential.</w:t>
-      </w:r>
-      <w:r>
-        <w:t xml:space="preserve"> </w:t>
-      </w:r>
-      <w:r>
-        <w:rPr>
-          <w:sz w:val="24"/>
-          <w:szCs w:val="24"/>
-        </w:rPr>
-        <w:t>(Schlegel &amp; Sattler, 2022)</w:t>
-      </w:r>
-    </w:p>
-    <w:p>
-      <w:pPr>
-        <w:spacing w:before="100" w:beforeAutospacing="1" w:after="100" w:afterAutospacing="1" w:line="240" w:lineRule="auto"/>
-        <w:rPr>
-          <w:rFonts w:ascii="Times New Roman" w:eastAsia="Times New Roman" w:hAnsi="Times New Roman" w:cs="Times New Roman"/>
-          <w:sz w:val="24"/>
-          <w:szCs w:val="24"/>
-        </w:rPr>
-      </w:pPr>
-      <w:r>
-        <w:rPr>
-          <w:rFonts w:ascii="Times New Roman" w:eastAsia="Times New Roman" w:hAnsi="Times New Roman" w:cs="Times New Roman"/>
-          <w:sz w:val="24"/>
-          <w:szCs w:val="24"/>
-        </w:rPr>
-        <w:t>Artifacts are stored in a structured directory:</w:t>
-      </w:r>
-    </w:p>
-    <w:p>
-      <w:pPr>
-        <w:numPr>
-          <w:ilvl w:val="0"/>
-          <w:numId w:val="11"/>
-        </w:numPr>
-        <w:spacing w:before="100" w:beforeAutospacing="1" w:after="100" w:afterAutospacing="1" w:line="240" w:lineRule="auto"/>
-        <w:rPr>
-          <w:rFonts w:ascii="Times New Roman" w:eastAsia="Times New Roman" w:hAnsi="Times New Roman" w:cs="Times New Roman"/>
-          <w:sz w:val="24"/>
-          <w:szCs w:val="24"/>
-        </w:rPr>
-      </w:pPr>
-      <w:r>
-        <w:rPr>
-          <w:rFonts w:ascii="Times New Roman" w:eastAsia="Times New Roman" w:hAnsi="Times New Roman" w:cs="Times New Roman"/>
-          <w:sz w:val="24"/>
-          <w:szCs w:val="24"/>
-        </w:rPr>
-        <w:t xml:space="preserve">raw data (historical, new) </w:t>
-      </w:r>
-    </w:p>
-    <w:p>
-      <w:pPr>
-        <w:numPr>
-          <w:ilvl w:val="0"/>
-          <w:numId w:val="11"/>
-        </w:numPr>
-        <w:spacing w:before="100" w:beforeAutospacing="1" w:after="100" w:afterAutospacing="1" w:line="240" w:lineRule="auto"/>
-        <w:rPr>
-          <w:rFonts w:ascii="Times New Roman" w:eastAsia="Times New Roman" w:hAnsi="Times New Roman" w:cs="Times New Roman"/>
-          <w:sz w:val="24"/>
-          <w:szCs w:val="24"/>
-        </w:rPr>
-      </w:pPr>
-      <w:r>
-        <w:rPr>
-          <w:rFonts w:ascii="Times New Roman" w:eastAsia="Times New Roman" w:hAnsi="Times New Roman" w:cs="Times New Roman"/>
-          <w:sz w:val="24"/>
-          <w:szCs w:val="24"/>
-        </w:rPr>
-        <w:t xml:space="preserve">processed data </w:t>
-      </w:r>
-    </w:p>
-    <w:p>
-      <w:pPr>
-        <w:numPr>
-          <w:ilvl w:val="0"/>
-          <w:numId w:val="11"/>
-        </w:numPr>
-        <w:spacing w:before="100" w:beforeAutospacing="1" w:after="100" w:afterAutospacing="1" w:line="240" w:lineRule="auto"/>
-        <w:rPr>
-          <w:rFonts w:ascii="Times New Roman" w:eastAsia="Times New Roman" w:hAnsi="Times New Roman" w:cs="Times New Roman"/>
-          <w:sz w:val="24"/>
-          <w:szCs w:val="24"/>
-        </w:rPr>
-      </w:pPr>
-      <w:r>
-        <w:rPr>
-          <w:rFonts w:ascii="Times New Roman" w:eastAsia="Times New Roman" w:hAnsi="Times New Roman" w:cs="Times New Roman"/>
-          <w:sz w:val="24"/>
-          <w:szCs w:val="24"/>
-        </w:rPr>
-        <w:t>trained model (</w:t>
+        <w:t xml:space="preserve">To support automated pipeline operation, a GitHub Actions workflow was configured to schedule the ingestion pipeline's execution. The workflow can run automatically based on a </w:t>
       </w:r>
       <w:proofErr w:type="spellStart"/>
       <w:r>
@@ -2417,7 +2091,7 @@
           <w:sz w:val="24"/>
           <w:szCs w:val="24"/>
         </w:rPr>
-        <w:t>model.pkl</w:t>
+        <w:t>cron</w:t>
       </w:r>
       <w:proofErr w:type="spellEnd"/>
       <w:r>
@@ -2426,361 +2100,12 @@
           <w:sz w:val="24"/>
           <w:szCs w:val="24"/>
         </w:rPr>
-        <w:t xml:space="preserve">) </w:t>
-      </w:r>
-    </w:p>
-    <w:p>
-      <w:pPr>
-        <w:numPr>
-          <w:ilvl w:val="0"/>
-          <w:numId w:val="11"/>
-        </w:numPr>
-        <w:spacing w:before="100" w:beforeAutospacing="1" w:after="100" w:afterAutospacing="1" w:line="240" w:lineRule="auto"/>
-        <w:rPr>
-          <w:rFonts w:ascii="Times New Roman" w:eastAsia="Times New Roman" w:hAnsi="Times New Roman" w:cs="Times New Roman"/>
-          <w:sz w:val="24"/>
-          <w:szCs w:val="24"/>
-        </w:rPr>
-      </w:pPr>
-      <w:r>
-        <w:rPr>
-          <w:rFonts w:ascii="Times New Roman" w:eastAsia="Times New Roman" w:hAnsi="Times New Roman" w:cs="Times New Roman"/>
-          <w:sz w:val="24"/>
-          <w:szCs w:val="24"/>
-        </w:rPr>
-        <w:t>feature schema (</w:t>
-      </w:r>
-      <w:proofErr w:type="spellStart"/>
-      <w:r>
-        <w:rPr>
-          <w:rFonts w:ascii="Times New Roman" w:eastAsia="Times New Roman" w:hAnsi="Times New Roman" w:cs="Times New Roman"/>
-          <w:sz w:val="24"/>
-          <w:szCs w:val="24"/>
-        </w:rPr>
-        <w:t>columns.pkl</w:t>
-      </w:r>
-      <w:proofErr w:type="spellEnd"/>
-      <w:r>
-        <w:rPr>
-          <w:rFonts w:ascii="Times New Roman" w:eastAsia="Times New Roman" w:hAnsi="Times New Roman" w:cs="Times New Roman"/>
-          <w:sz w:val="24"/>
-          <w:szCs w:val="24"/>
-        </w:rPr>
-        <w:t xml:space="preserve">) </w:t>
-      </w:r>
-    </w:p>
-    <w:p>
-      <w:pPr>
-        <w:numPr>
-          <w:ilvl w:val="0"/>
-          <w:numId w:val="11"/>
-        </w:numPr>
-        <w:spacing w:before="100" w:beforeAutospacing="1" w:after="100" w:afterAutospacing="1" w:line="240" w:lineRule="auto"/>
-        <w:rPr>
-          <w:rFonts w:ascii="Times New Roman" w:eastAsia="Times New Roman" w:hAnsi="Times New Roman" w:cs="Times New Roman"/>
-          <w:sz w:val="24"/>
-          <w:szCs w:val="24"/>
-        </w:rPr>
-      </w:pPr>
-      <w:r>
-        <w:rPr>
-          <w:rFonts w:ascii="Times New Roman" w:eastAsia="Times New Roman" w:hAnsi="Times New Roman" w:cs="Times New Roman"/>
-          <w:sz w:val="24"/>
-          <w:szCs w:val="24"/>
-        </w:rPr>
-        <w:t xml:space="preserve">evaluation metrics </w:t>
-      </w:r>
-    </w:p>
-    <w:p>
-      <w:pPr>
-        <w:numPr>
-          <w:ilvl w:val="0"/>
-          <w:numId w:val="11"/>
-        </w:numPr>
-        <w:spacing w:before="100" w:beforeAutospacing="1" w:after="100" w:afterAutospacing="1" w:line="240" w:lineRule="auto"/>
-        <w:rPr>
-          <w:rFonts w:ascii="Times New Roman" w:eastAsia="Times New Roman" w:hAnsi="Times New Roman" w:cs="Times New Roman"/>
-          <w:sz w:val="24"/>
-          <w:szCs w:val="24"/>
-        </w:rPr>
-      </w:pPr>
-      <w:r>
-        <w:rPr>
-          <w:rFonts w:ascii="Times New Roman" w:eastAsia="Times New Roman" w:hAnsi="Times New Roman" w:cs="Times New Roman"/>
-          <w:sz w:val="24"/>
-          <w:szCs w:val="24"/>
-        </w:rPr>
-        <w:t xml:space="preserve">logs </w:t>
-      </w:r>
-    </w:p>
-    <w:p>
-      <w:pPr>
-        <w:spacing w:before="100" w:beforeAutospacing="1" w:after="100" w:afterAutospacing="1" w:line="240" w:lineRule="auto"/>
-        <w:rPr>
-          <w:rFonts w:ascii="Times New Roman" w:eastAsia="Times New Roman" w:hAnsi="Times New Roman" w:cs="Times New Roman"/>
-          <w:sz w:val="24"/>
-          <w:szCs w:val="24"/>
-        </w:rPr>
-      </w:pPr>
-      <w:r>
-        <w:rPr>
-          <w:rFonts w:ascii="Times New Roman" w:eastAsia="Times New Roman" w:hAnsi="Times New Roman" w:cs="Times New Roman"/>
-          <w:sz w:val="24"/>
-          <w:szCs w:val="24"/>
-        </w:rPr>
-        <w:t>Why important:</w:t>
-      </w:r>
-      <w:r>
-        <w:rPr>
-          <w:rFonts w:ascii="Times New Roman" w:eastAsia="Times New Roman" w:hAnsi="Times New Roman" w:cs="Times New Roman"/>
-          <w:sz w:val="24"/>
-          <w:szCs w:val="24"/>
-        </w:rPr>
-        <w:br/>
-        <w:t>Artifact storage enables:</w:t>
-      </w:r>
-    </w:p>
-    <w:p>
-      <w:pPr>
-        <w:numPr>
-          <w:ilvl w:val="0"/>
-          <w:numId w:val="12"/>
-        </w:numPr>
-        <w:spacing w:before="100" w:beforeAutospacing="1" w:after="100" w:afterAutospacing="1" w:line="240" w:lineRule="auto"/>
-        <w:rPr>
-          <w:rFonts w:ascii="Times New Roman" w:eastAsia="Times New Roman" w:hAnsi="Times New Roman" w:cs="Times New Roman"/>
-          <w:sz w:val="24"/>
-          <w:szCs w:val="24"/>
-        </w:rPr>
-      </w:pPr>
-      <w:r>
-        <w:rPr>
-          <w:rFonts w:ascii="Times New Roman" w:eastAsia="Times New Roman" w:hAnsi="Times New Roman" w:cs="Times New Roman"/>
-          <w:sz w:val="24"/>
-          <w:szCs w:val="24"/>
-        </w:rPr>
-        <w:t xml:space="preserve">reproducibility </w:t>
-      </w:r>
-    </w:p>
-    <w:p>
-      <w:pPr>
-        <w:numPr>
-          <w:ilvl w:val="0"/>
-          <w:numId w:val="12"/>
-        </w:numPr>
-        <w:spacing w:before="100" w:beforeAutospacing="1" w:after="100" w:afterAutospacing="1" w:line="240" w:lineRule="auto"/>
-        <w:rPr>
-          <w:rFonts w:ascii="Times New Roman" w:eastAsia="Times New Roman" w:hAnsi="Times New Roman" w:cs="Times New Roman"/>
-          <w:sz w:val="24"/>
-          <w:szCs w:val="24"/>
-        </w:rPr>
-      </w:pPr>
-      <w:r>
-        <w:rPr>
-          <w:rFonts w:ascii="Times New Roman" w:eastAsia="Times New Roman" w:hAnsi="Times New Roman" w:cs="Times New Roman"/>
-          <w:sz w:val="24"/>
-          <w:szCs w:val="24"/>
-        </w:rPr>
-        <w:t xml:space="preserve">debugging </w:t>
-      </w:r>
-    </w:p>
-    <w:p>
-      <w:pPr>
-        <w:numPr>
-          <w:ilvl w:val="0"/>
-          <w:numId w:val="12"/>
-        </w:numPr>
-        <w:spacing w:before="100" w:beforeAutospacing="1" w:after="100" w:afterAutospacing="1" w:line="240" w:lineRule="auto"/>
-        <w:rPr>
-          <w:rFonts w:ascii="Times New Roman" w:eastAsia="Times New Roman" w:hAnsi="Times New Roman" w:cs="Times New Roman"/>
-          <w:sz w:val="24"/>
-          <w:szCs w:val="24"/>
-        </w:rPr>
-      </w:pPr>
-      <w:r>
-        <w:rPr>
-          <w:rFonts w:ascii="Times New Roman" w:eastAsia="Times New Roman" w:hAnsi="Times New Roman" w:cs="Times New Roman"/>
-          <w:sz w:val="24"/>
-          <w:szCs w:val="24"/>
-        </w:rPr>
-        <w:t xml:space="preserve">auditability </w:t>
-      </w:r>
-    </w:p>
-    <w:p>
-      <w:pPr>
-        <w:spacing w:before="100" w:beforeAutospacing="1" w:after="100" w:afterAutospacing="1" w:line="240" w:lineRule="auto"/>
-        <w:outlineLvl w:val="0"/>
-        <w:rPr>
-          <w:rFonts w:ascii="Times New Roman" w:eastAsia="Times New Roman" w:hAnsi="Times New Roman" w:cs="Times New Roman"/>
-          <w:b/>
-          <w:bCs/>
-          <w:kern w:val="36"/>
-          <w:sz w:val="44"/>
-          <w:szCs w:val="44"/>
-        </w:rPr>
-      </w:pPr>
-      <w:r>
-        <w:rPr>
-          <w:rFonts w:ascii="Times New Roman" w:eastAsia="Times New Roman" w:hAnsi="Times New Roman" w:cs="Times New Roman"/>
-          <w:b/>
-          <w:bCs/>
-          <w:kern w:val="36"/>
-          <w:sz w:val="44"/>
-          <w:szCs w:val="44"/>
-        </w:rPr>
-        <w:t>6. Deployment Setup</w:t>
-      </w:r>
-    </w:p>
-    <w:p>
-      <w:pPr>
-        <w:spacing w:before="100" w:beforeAutospacing="1" w:after="100" w:afterAutospacing="1" w:line="240" w:lineRule="auto"/>
-        <w:outlineLvl w:val="1"/>
-        <w:rPr>
-          <w:rFonts w:ascii="Times New Roman" w:eastAsia="Times New Roman" w:hAnsi="Times New Roman" w:cs="Times New Roman"/>
-          <w:b/>
-          <w:bCs/>
-          <w:sz w:val="36"/>
-          <w:szCs w:val="36"/>
-        </w:rPr>
-      </w:pPr>
-      <w:r>
-        <w:rPr>
-          <w:rFonts w:ascii="Times New Roman" w:eastAsia="Times New Roman" w:hAnsi="Times New Roman" w:cs="Times New Roman"/>
-          <w:b/>
-          <w:bCs/>
-          <w:sz w:val="36"/>
-          <w:szCs w:val="36"/>
-        </w:rPr>
-        <w:t>6.1 API Deployment</w:t>
-      </w:r>
-    </w:p>
-    <w:p>
-      <w:pPr>
-        <w:spacing w:before="100" w:beforeAutospacing="1" w:after="100" w:afterAutospacing="1" w:line="240" w:lineRule="auto"/>
-        <w:rPr>
-          <w:rFonts w:ascii="Times New Roman" w:eastAsia="Times New Roman" w:hAnsi="Times New Roman" w:cs="Times New Roman"/>
-          <w:sz w:val="24"/>
-          <w:szCs w:val="24"/>
-        </w:rPr>
-      </w:pPr>
-      <w:r>
-        <w:rPr>
-          <w:rFonts w:ascii="Times New Roman" w:eastAsia="Times New Roman" w:hAnsi="Times New Roman" w:cs="Times New Roman"/>
-          <w:sz w:val="24"/>
-          <w:szCs w:val="24"/>
-        </w:rPr>
-        <w:t>The model is deployed using FastAPI, exposing a /predict endpoint.</w:t>
-      </w:r>
-    </w:p>
-    <w:p>
-      <w:pPr>
-        <w:spacing w:before="100" w:beforeAutospacing="1" w:after="100" w:afterAutospacing="1" w:line="240" w:lineRule="auto"/>
-        <w:rPr>
-          <w:rFonts w:ascii="Times New Roman" w:eastAsia="Times New Roman" w:hAnsi="Times New Roman" w:cs="Times New Roman"/>
-          <w:sz w:val="24"/>
-          <w:szCs w:val="24"/>
-        </w:rPr>
-      </w:pPr>
-      <w:r>
-        <w:rPr>
-          <w:rFonts w:ascii="Times New Roman" w:eastAsia="Times New Roman" w:hAnsi="Times New Roman" w:cs="Times New Roman"/>
-          <w:sz w:val="24"/>
-          <w:szCs w:val="24"/>
-        </w:rPr>
-        <w:t>Why FastAPI:</w:t>
-      </w:r>
-    </w:p>
-    <w:p>
-      <w:pPr>
-        <w:numPr>
-          <w:ilvl w:val="0"/>
-          <w:numId w:val="13"/>
-        </w:numPr>
-        <w:spacing w:before="100" w:beforeAutospacing="1" w:after="100" w:afterAutospacing="1" w:line="240" w:lineRule="auto"/>
-        <w:rPr>
-          <w:rFonts w:ascii="Times New Roman" w:eastAsia="Times New Roman" w:hAnsi="Times New Roman" w:cs="Times New Roman"/>
-          <w:sz w:val="24"/>
-          <w:szCs w:val="24"/>
-        </w:rPr>
-      </w:pPr>
-      <w:r>
-        <w:rPr>
-          <w:rFonts w:ascii="Times New Roman" w:eastAsia="Times New Roman" w:hAnsi="Times New Roman" w:cs="Times New Roman"/>
-          <w:sz w:val="24"/>
-          <w:szCs w:val="24"/>
-        </w:rPr>
-        <w:t xml:space="preserve">lightweight </w:t>
-      </w:r>
-    </w:p>
-    <w:p>
-      <w:pPr>
-        <w:numPr>
-          <w:ilvl w:val="0"/>
-          <w:numId w:val="13"/>
-        </w:numPr>
-        <w:spacing w:before="100" w:beforeAutospacing="1" w:after="100" w:afterAutospacing="1" w:line="240" w:lineRule="auto"/>
-        <w:rPr>
-          <w:rFonts w:ascii="Times New Roman" w:eastAsia="Times New Roman" w:hAnsi="Times New Roman" w:cs="Times New Roman"/>
-          <w:sz w:val="24"/>
-          <w:szCs w:val="24"/>
-        </w:rPr>
-      </w:pPr>
-      <w:r>
-        <w:rPr>
-          <w:rFonts w:ascii="Times New Roman" w:eastAsia="Times New Roman" w:hAnsi="Times New Roman" w:cs="Times New Roman"/>
-          <w:sz w:val="24"/>
-          <w:szCs w:val="24"/>
-        </w:rPr>
-        <w:t xml:space="preserve">fast </w:t>
-      </w:r>
-    </w:p>
-    <w:p>
-      <w:pPr>
-        <w:numPr>
-          <w:ilvl w:val="0"/>
-          <w:numId w:val="13"/>
-        </w:numPr>
-        <w:spacing w:before="100" w:beforeAutospacing="1" w:after="100" w:afterAutospacing="1" w:line="240" w:lineRule="auto"/>
-        <w:rPr>
-          <w:rFonts w:ascii="Times New Roman" w:eastAsia="Times New Roman" w:hAnsi="Times New Roman" w:cs="Times New Roman"/>
-          <w:sz w:val="24"/>
-          <w:szCs w:val="24"/>
-        </w:rPr>
-      </w:pPr>
-      <w:r>
-        <w:rPr>
-          <w:rFonts w:ascii="Times New Roman" w:eastAsia="Times New Roman" w:hAnsi="Times New Roman" w:cs="Times New Roman"/>
-          <w:sz w:val="24"/>
-          <w:szCs w:val="24"/>
-        </w:rPr>
-        <w:t xml:space="preserve">built-in documentation (Swagger) </w:t>
-      </w:r>
-    </w:p>
-    <w:p>
-      <w:pPr>
-        <w:numPr>
-          <w:ilvl w:val="0"/>
-          <w:numId w:val="13"/>
-        </w:numPr>
-        <w:spacing w:before="100" w:beforeAutospacing="1" w:after="100" w:afterAutospacing="1" w:line="240" w:lineRule="auto"/>
-        <w:rPr>
-          <w:rFonts w:ascii="Times New Roman" w:eastAsia="Times New Roman" w:hAnsi="Times New Roman" w:cs="Times New Roman"/>
-          <w:sz w:val="24"/>
-          <w:szCs w:val="24"/>
-        </w:rPr>
-      </w:pPr>
-      <w:r>
-        <w:rPr>
-          <w:rFonts w:ascii="Times New Roman" w:eastAsia="Times New Roman" w:hAnsi="Times New Roman" w:cs="Times New Roman"/>
-          <w:sz w:val="24"/>
-          <w:szCs w:val="24"/>
-        </w:rPr>
-        <w:t xml:space="preserve">easy integration with ML models </w:t>
-      </w:r>
-    </w:p>
-    <w:p>
-      <w:pPr>
-        <w:spacing w:after="0" w:line="240" w:lineRule="auto"/>
+        <w:t xml:space="preserve"> schedule or be triggered manually. This simulates how new customer data could be ingested regularly in a production environment without manual intervention.</w:t>
+      </w:r>
+    </w:p>
+    <w:p>
+      <w:pPr>
+        <w:spacing w:before="100" w:beforeAutospacing="1" w:after="100" w:afterAutospacing="1" w:line="240" w:lineRule="auto"/>
         <w:jc w:val="center"/>
         <w:rPr>
           <w:rFonts w:ascii="Times New Roman" w:eastAsia="Times New Roman" w:hAnsi="Times New Roman" w:cs="Times New Roman"/>
@@ -2794,12 +2119,11 @@
           <w:sz w:val="24"/>
           <w:szCs w:val="24"/>
         </w:rPr>
-        <w:lastRenderedPageBreak/>
         <w:drawing>
-          <wp:inline distT="0" distB="0" distL="0" distR="0" wp14:anchorId="6CB4DE71" wp14:editId="5DF02589">
-            <wp:extent cx="5480050" cy="3143885"/>
-            <wp:effectExtent l="0" t="0" r="6350" b="0"/>
-            <wp:docPr id="2" name="Picture 2"/>
+          <wp:inline distT="0" distB="0" distL="0" distR="0" wp14:anchorId="6E6A74AC" wp14:editId="0EB71F9F">
+            <wp:extent cx="6138407" cy="3160395"/>
+            <wp:effectExtent l="0" t="0" r="0" b="1905"/>
+            <wp:docPr id="3" name="Picture 3"/>
             <wp:cNvGraphicFramePr>
               <a:graphicFrameLocks xmlns:a="http://schemas.openxmlformats.org/drawingml/2006/main" noChangeAspect="1"/>
             </wp:cNvGraphicFramePr>
@@ -2819,7 +2143,7 @@
                   <pic:spPr>
                     <a:xfrm>
                       <a:off x="0" y="0"/>
-                      <a:ext cx="5480050" cy="3143885"/>
+                      <a:ext cx="6141267" cy="3161868"/>
                     </a:xfrm>
                     <a:prstGeom prst="rect">
                       <a:avLst/>
@@ -2848,8 +2172,115 @@
           <w:sz w:val="24"/>
           <w:szCs w:val="24"/>
         </w:rPr>
-        <w:t>Figure 2: FastAPI Swagger UI showing successful churn prediction.</w:t>
-      </w:r>
+        <w:t xml:space="preserve">Figure 2: </w:t>
+      </w:r>
+      <w:r>
+        <w:rPr>
+          <w:rFonts w:ascii="Times New Roman" w:eastAsia="Times New Roman" w:hAnsi="Times New Roman" w:cs="Times New Roman"/>
+          <w:sz w:val="24"/>
+          <w:szCs w:val="24"/>
+        </w:rPr>
+        <w:t>GitHub Actions workflow</w:t>
+      </w:r>
+    </w:p>
+    <w:p>
+      <w:pPr>
+        <w:spacing w:before="100" w:beforeAutospacing="1" w:after="100" w:afterAutospacing="1" w:line="240" w:lineRule="auto"/>
+        <w:rPr>
+          <w:rFonts w:ascii="Times New Roman" w:eastAsia="Times New Roman" w:hAnsi="Times New Roman" w:cs="Times New Roman"/>
+          <w:sz w:val="24"/>
+          <w:szCs w:val="24"/>
+        </w:rPr>
+      </w:pPr>
+      <w:r>
+        <w:rPr>
+          <w:rFonts w:ascii="Times New Roman" w:eastAsia="Times New Roman" w:hAnsi="Times New Roman" w:cs="Times New Roman"/>
+          <w:sz w:val="24"/>
+          <w:szCs w:val="24"/>
+        </w:rPr>
+        <w:t>This allows:</w:t>
+      </w:r>
+      <w:r>
+        <w:rPr>
+          <w:rFonts w:ascii="Times New Roman" w:eastAsia="Times New Roman" w:hAnsi="Times New Roman" w:cs="Times New Roman"/>
+          <w:sz w:val="24"/>
+          <w:szCs w:val="24"/>
+        </w:rPr>
+        <w:br/>
+        <w:t>• Traceability of predictions, meaning each prediction can be linked back to the input data that produced it.</w:t>
+      </w:r>
+      <w:r>
+        <w:rPr>
+          <w:rFonts w:ascii="Times New Roman" w:eastAsia="Times New Roman" w:hAnsi="Times New Roman" w:cs="Times New Roman"/>
+          <w:sz w:val="24"/>
+          <w:szCs w:val="24"/>
+        </w:rPr>
+        <w:br/>
+        <w:t>• Detection of anomalies, such as unusual prediction patterns, missing values, or unexpected changes in incoming data.</w:t>
+      </w:r>
+      <w:r>
+        <w:rPr>
+          <w:rFonts w:ascii="Times New Roman" w:eastAsia="Times New Roman" w:hAnsi="Times New Roman" w:cs="Times New Roman"/>
+          <w:sz w:val="24"/>
+          <w:szCs w:val="24"/>
+        </w:rPr>
+        <w:br/>
+        <w:t>• Easier debugging of system behavior, since logs provide a clear record of what happened at each stage of the pipeline.</w:t>
+      </w:r>
+    </w:p>
+    <w:p>
+      <w:pPr>
+        <w:spacing w:before="100" w:beforeAutospacing="1" w:after="100" w:afterAutospacing="1" w:line="240" w:lineRule="auto"/>
+        <w:rPr>
+          <w:rFonts w:ascii="Times New Roman" w:eastAsia="Times New Roman" w:hAnsi="Times New Roman" w:cs="Times New Roman"/>
+          <w:sz w:val="24"/>
+          <w:szCs w:val="24"/>
+        </w:rPr>
+      </w:pPr>
+      <w:r>
+        <w:rPr>
+          <w:rFonts w:ascii="Times New Roman" w:eastAsia="Times New Roman" w:hAnsi="Times New Roman" w:cs="Times New Roman"/>
+          <w:sz w:val="24"/>
+          <w:szCs w:val="24"/>
+        </w:rPr>
+        <w:t>Future improvements:</w:t>
+      </w:r>
+      <w:r>
+        <w:rPr>
+          <w:rFonts w:ascii="Times New Roman" w:eastAsia="Times New Roman" w:hAnsi="Times New Roman" w:cs="Times New Roman"/>
+          <w:sz w:val="24"/>
+          <w:szCs w:val="24"/>
+        </w:rPr>
+        <w:br/>
+        <w:t>• Data drift detection can be added to identify changes in the pattern or distribution of incoming data over time.</w:t>
+      </w:r>
+      <w:r>
+        <w:rPr>
+          <w:rFonts w:ascii="Times New Roman" w:eastAsia="Times New Roman" w:hAnsi="Times New Roman" w:cs="Times New Roman"/>
+          <w:sz w:val="24"/>
+          <w:szCs w:val="24"/>
+        </w:rPr>
+        <w:br/>
+      </w:r>
+      <w:r>
+        <w:rPr>
+          <w:rFonts w:ascii="Times New Roman" w:eastAsia="Times New Roman" w:hAnsi="Times New Roman" w:cs="Times New Roman"/>
+          <w:sz w:val="24"/>
+          <w:szCs w:val="24"/>
+        </w:rPr>
+        <w:lastRenderedPageBreak/>
+        <w:t>• Performance degradation alerts can be introduced to notify users when the model’s accuracy or reliability starts to decline.</w:t>
+      </w:r>
+    </w:p>
+    <w:p>
+      <w:pPr>
+        <w:spacing w:after="0" w:line="240" w:lineRule="auto"/>
+        <w:rPr>
+          <w:rFonts w:ascii="Times New Roman" w:eastAsia="Times New Roman" w:hAnsi="Times New Roman" w:cs="Times New Roman"/>
+          <w:sz w:val="24"/>
+          <w:szCs w:val="24"/>
+        </w:rPr>
+      </w:pPr>
     </w:p>
     <w:p>
       <w:pPr>
@@ -2871,280 +2302,99 @@
           <w:sz w:val="36"/>
           <w:szCs w:val="36"/>
         </w:rPr>
-        <w:t>6.2 Docker Deployment</w:t>
-      </w:r>
-    </w:p>
-    <w:p>
-      <w:pPr>
-        <w:spacing w:before="100" w:beforeAutospacing="1" w:after="100" w:afterAutospacing="1" w:line="240" w:lineRule="auto"/>
-        <w:rPr>
-          <w:rFonts w:ascii="Times New Roman" w:eastAsia="Times New Roman" w:hAnsi="Times New Roman" w:cs="Times New Roman"/>
-          <w:sz w:val="24"/>
-          <w:szCs w:val="24"/>
-        </w:rPr>
-      </w:pPr>
-      <w:r>
-        <w:rPr>
-          <w:rFonts w:ascii="Times New Roman" w:eastAsia="Times New Roman" w:hAnsi="Times New Roman" w:cs="Times New Roman"/>
-          <w:sz w:val="24"/>
-          <w:szCs w:val="24"/>
-        </w:rPr>
-        <w:t>The entire system is containerized using Docker.</w:t>
-      </w:r>
-    </w:p>
-    <w:p>
-      <w:pPr>
-        <w:spacing w:before="100" w:beforeAutospacing="1" w:after="100" w:afterAutospacing="1" w:line="240" w:lineRule="auto"/>
-        <w:rPr>
-          <w:rFonts w:ascii="Times New Roman" w:eastAsia="Times New Roman" w:hAnsi="Times New Roman" w:cs="Times New Roman"/>
-          <w:sz w:val="24"/>
-          <w:szCs w:val="24"/>
-        </w:rPr>
-      </w:pPr>
-      <w:r>
-        <w:rPr>
-          <w:rFonts w:ascii="Times New Roman" w:eastAsia="Times New Roman" w:hAnsi="Times New Roman" w:cs="Times New Roman"/>
-          <w:sz w:val="24"/>
-          <w:szCs w:val="24"/>
-        </w:rPr>
-        <w:t>Steps:</w:t>
-      </w:r>
-    </w:p>
-    <w:p>
-      <w:pPr>
-        <w:numPr>
-          <w:ilvl w:val="0"/>
-          <w:numId w:val="14"/>
-        </w:numPr>
-        <w:spacing w:before="100" w:beforeAutospacing="1" w:after="100" w:afterAutospacing="1" w:line="240" w:lineRule="auto"/>
-        <w:rPr>
-          <w:rFonts w:ascii="Times New Roman" w:eastAsia="Times New Roman" w:hAnsi="Times New Roman" w:cs="Times New Roman"/>
-          <w:sz w:val="24"/>
-          <w:szCs w:val="24"/>
-        </w:rPr>
-      </w:pPr>
-      <w:r>
-        <w:rPr>
-          <w:rFonts w:ascii="Times New Roman" w:eastAsia="Times New Roman" w:hAnsi="Times New Roman" w:cs="Times New Roman"/>
-          <w:sz w:val="24"/>
-          <w:szCs w:val="24"/>
-        </w:rPr>
-        <w:t xml:space="preserve">build image </w:t>
-      </w:r>
-    </w:p>
-    <w:p>
-      <w:pPr>
-        <w:numPr>
-          <w:ilvl w:val="0"/>
-          <w:numId w:val="14"/>
-        </w:numPr>
-        <w:spacing w:before="100" w:beforeAutospacing="1" w:after="100" w:afterAutospacing="1" w:line="240" w:lineRule="auto"/>
-        <w:rPr>
-          <w:rFonts w:ascii="Times New Roman" w:eastAsia="Times New Roman" w:hAnsi="Times New Roman" w:cs="Times New Roman"/>
-          <w:sz w:val="24"/>
-          <w:szCs w:val="24"/>
-        </w:rPr>
-      </w:pPr>
-      <w:r>
-        <w:rPr>
-          <w:rFonts w:ascii="Times New Roman" w:eastAsia="Times New Roman" w:hAnsi="Times New Roman" w:cs="Times New Roman"/>
-          <w:sz w:val="24"/>
-          <w:szCs w:val="24"/>
-        </w:rPr>
-        <w:t xml:space="preserve">run container </w:t>
-      </w:r>
-    </w:p>
-    <w:p>
-      <w:pPr>
-        <w:numPr>
-          <w:ilvl w:val="0"/>
-          <w:numId w:val="14"/>
-        </w:numPr>
-        <w:spacing w:before="100" w:beforeAutospacing="1" w:after="100" w:afterAutospacing="1" w:line="240" w:lineRule="auto"/>
-        <w:rPr>
-          <w:rFonts w:ascii="Times New Roman" w:eastAsia="Times New Roman" w:hAnsi="Times New Roman" w:cs="Times New Roman"/>
-          <w:sz w:val="24"/>
-          <w:szCs w:val="24"/>
-        </w:rPr>
-      </w:pPr>
-      <w:r>
-        <w:rPr>
-          <w:rFonts w:ascii="Times New Roman" w:eastAsia="Times New Roman" w:hAnsi="Times New Roman" w:cs="Times New Roman"/>
-          <w:sz w:val="24"/>
-          <w:szCs w:val="24"/>
-        </w:rPr>
-        <w:t xml:space="preserve">expose port 8000 </w:t>
-      </w:r>
-    </w:p>
-    <w:p>
-      <w:pPr>
-        <w:spacing w:before="100" w:beforeAutospacing="1" w:after="100" w:afterAutospacing="1" w:line="240" w:lineRule="auto"/>
-        <w:rPr>
-          <w:rFonts w:ascii="Times New Roman" w:eastAsia="Times New Roman" w:hAnsi="Times New Roman" w:cs="Times New Roman"/>
-          <w:sz w:val="24"/>
-          <w:szCs w:val="24"/>
-        </w:rPr>
-      </w:pPr>
-      <w:r>
-        <w:rPr>
-          <w:rFonts w:ascii="Times New Roman" w:eastAsia="Times New Roman" w:hAnsi="Times New Roman" w:cs="Times New Roman"/>
-          <w:sz w:val="24"/>
-          <w:szCs w:val="24"/>
-        </w:rPr>
-        <w:t>Why Docker:</w:t>
-      </w:r>
-    </w:p>
-    <w:p>
-      <w:pPr>
-        <w:numPr>
-          <w:ilvl w:val="0"/>
-          <w:numId w:val="15"/>
-        </w:numPr>
-        <w:spacing w:before="100" w:beforeAutospacing="1" w:after="100" w:afterAutospacing="1" w:line="240" w:lineRule="auto"/>
-        <w:rPr>
-          <w:rFonts w:ascii="Times New Roman" w:eastAsia="Times New Roman" w:hAnsi="Times New Roman" w:cs="Times New Roman"/>
-          <w:sz w:val="24"/>
-          <w:szCs w:val="24"/>
-        </w:rPr>
-      </w:pPr>
-      <w:r>
-        <w:rPr>
-          <w:rFonts w:ascii="Times New Roman" w:eastAsia="Times New Roman" w:hAnsi="Times New Roman" w:cs="Times New Roman"/>
-          <w:sz w:val="24"/>
-          <w:szCs w:val="24"/>
-        </w:rPr>
-        <w:t xml:space="preserve">ensures </w:t>
-      </w:r>
-      <w:r>
-        <w:rPr>
-          <w:rFonts w:ascii="Times New Roman" w:eastAsia="Times New Roman" w:hAnsi="Times New Roman" w:cs="Times New Roman"/>
-          <w:sz w:val="24"/>
-          <w:szCs w:val="24"/>
-        </w:rPr>
-        <w:t>environmental</w:t>
-      </w:r>
-      <w:r>
-        <w:rPr>
-          <w:rFonts w:ascii="Times New Roman" w:eastAsia="Times New Roman" w:hAnsi="Times New Roman" w:cs="Times New Roman"/>
-          <w:sz w:val="24"/>
-          <w:szCs w:val="24"/>
-        </w:rPr>
-        <w:t xml:space="preserve"> consistency </w:t>
-      </w:r>
-    </w:p>
-    <w:p>
-      <w:pPr>
-        <w:numPr>
-          <w:ilvl w:val="0"/>
-          <w:numId w:val="15"/>
-        </w:numPr>
-        <w:spacing w:before="100" w:beforeAutospacing="1" w:after="100" w:afterAutospacing="1" w:line="240" w:lineRule="auto"/>
-        <w:rPr>
-          <w:rFonts w:ascii="Times New Roman" w:eastAsia="Times New Roman" w:hAnsi="Times New Roman" w:cs="Times New Roman"/>
-          <w:sz w:val="24"/>
-          <w:szCs w:val="24"/>
-        </w:rPr>
-      </w:pPr>
-      <w:r>
-        <w:rPr>
-          <w:rFonts w:ascii="Times New Roman" w:eastAsia="Times New Roman" w:hAnsi="Times New Roman" w:cs="Times New Roman"/>
-          <w:sz w:val="24"/>
-          <w:szCs w:val="24"/>
-        </w:rPr>
-        <w:t xml:space="preserve">simplifies deployment </w:t>
-      </w:r>
-    </w:p>
-    <w:p>
-      <w:pPr>
-        <w:numPr>
-          <w:ilvl w:val="0"/>
-          <w:numId w:val="15"/>
-        </w:numPr>
-        <w:spacing w:before="100" w:beforeAutospacing="1" w:after="100" w:afterAutospacing="1" w:line="240" w:lineRule="auto"/>
-        <w:rPr>
-          <w:rFonts w:ascii="Times New Roman" w:eastAsia="Times New Roman" w:hAnsi="Times New Roman" w:cs="Times New Roman"/>
-          <w:sz w:val="24"/>
-          <w:szCs w:val="24"/>
-        </w:rPr>
-      </w:pPr>
-      <w:r>
-        <w:rPr>
-          <w:rFonts w:ascii="Times New Roman" w:eastAsia="Times New Roman" w:hAnsi="Times New Roman" w:cs="Times New Roman"/>
-          <w:sz w:val="24"/>
-          <w:szCs w:val="24"/>
-        </w:rPr>
-        <w:t xml:space="preserve">supports reproducibility </w:t>
-      </w:r>
-    </w:p>
-    <w:p>
-      <w:pPr>
-        <w:spacing w:before="100" w:beforeAutospacing="1" w:after="100" w:afterAutospacing="1" w:line="240" w:lineRule="auto"/>
-        <w:outlineLvl w:val="1"/>
+        <w:t>4.3 Versioning</w:t>
+      </w:r>
+    </w:p>
+    <w:p>
+      <w:pPr>
+        <w:spacing w:before="100" w:beforeAutospacing="1" w:after="100" w:afterAutospacing="1" w:line="240" w:lineRule="auto"/>
+        <w:rPr>
+          <w:rFonts w:ascii="Times New Roman" w:eastAsia="Times New Roman" w:hAnsi="Times New Roman" w:cs="Times New Roman"/>
+          <w:sz w:val="24"/>
+          <w:szCs w:val="24"/>
+        </w:rPr>
+      </w:pPr>
+      <w:r>
+        <w:rPr>
+          <w:rFonts w:ascii="Times New Roman" w:eastAsia="Times New Roman" w:hAnsi="Times New Roman" w:cs="Times New Roman"/>
+          <w:sz w:val="24"/>
+          <w:szCs w:val="24"/>
+        </w:rPr>
+        <w:t>Artifacts are versioned implicitly through file storage:</w:t>
+      </w:r>
+      <w:r>
+        <w:rPr>
+          <w:rFonts w:ascii="Times New Roman" w:eastAsia="Times New Roman" w:hAnsi="Times New Roman" w:cs="Times New Roman"/>
+          <w:sz w:val="24"/>
+          <w:szCs w:val="24"/>
+        </w:rPr>
+        <w:br/>
+        <w:t>• Datasets are stored in separate files, which helps preserve the original historical data and any updated versions over time.</w:t>
+      </w:r>
+      <w:r>
+        <w:rPr>
+          <w:rFonts w:ascii="Times New Roman" w:eastAsia="Times New Roman" w:hAnsi="Times New Roman" w:cs="Times New Roman"/>
+          <w:sz w:val="24"/>
+          <w:szCs w:val="24"/>
+        </w:rPr>
+        <w:br/>
+        <w:t>• Processed data files are saved after each transformation step, making it easier to track changes made during preprocessing.</w:t>
+      </w:r>
+      <w:r>
+        <w:rPr>
+          <w:rFonts w:ascii="Times New Roman" w:eastAsia="Times New Roman" w:hAnsi="Times New Roman" w:cs="Times New Roman"/>
+          <w:sz w:val="24"/>
+          <w:szCs w:val="24"/>
+        </w:rPr>
+        <w:br/>
+        <w:t>• Model files are stored whenever a new model is trained, allowing different trained versions to be kept for comparison or reuse.</w:t>
+      </w:r>
+      <w:r>
+        <w:rPr>
+          <w:rFonts w:ascii="Times New Roman" w:eastAsia="Times New Roman" w:hAnsi="Times New Roman" w:cs="Times New Roman"/>
+          <w:sz w:val="24"/>
+          <w:szCs w:val="24"/>
+        </w:rPr>
+        <w:br/>
+        <w:t>• Logs are also saved as records of system activity, helping track updates, predictions, and system behavior over time.</w:t>
+      </w:r>
+    </w:p>
+    <w:p>
+      <w:pPr>
+        <w:spacing w:before="100" w:beforeAutospacing="1" w:after="100" w:afterAutospacing="1" w:line="240" w:lineRule="auto"/>
+        <w:rPr>
+          <w:rFonts w:ascii="Times New Roman" w:eastAsia="Times New Roman" w:hAnsi="Times New Roman" w:cs="Times New Roman"/>
+          <w:sz w:val="24"/>
+          <w:szCs w:val="24"/>
+        </w:rPr>
+      </w:pPr>
+      <w:r>
+        <w:rPr>
+          <w:rFonts w:ascii="Times New Roman" w:eastAsia="Times New Roman" w:hAnsi="Times New Roman" w:cs="Times New Roman"/>
+          <w:sz w:val="24"/>
+          <w:szCs w:val="24"/>
+        </w:rPr>
+        <w:t>Versioning supports reproducibility by making it possible to repeat the same workflow and obtain consistent results. It also allows rollback to previous versions of data or models if errors occur or if a newer version performs worse.</w:t>
+      </w:r>
+    </w:p>
+    <w:p>
+      <w:pPr>
+        <w:spacing w:before="100" w:beforeAutospacing="1" w:after="100" w:afterAutospacing="1" w:line="240" w:lineRule="auto"/>
+        <w:outlineLvl w:val="0"/>
         <w:rPr>
           <w:rFonts w:ascii="Times New Roman" w:eastAsia="Times New Roman" w:hAnsi="Times New Roman" w:cs="Times New Roman"/>
           <w:b/>
           <w:bCs/>
-          <w:sz w:val="36"/>
-          <w:szCs w:val="36"/>
-        </w:rPr>
-      </w:pPr>
-      <w:r>
-        <w:rPr>
-          <w:rFonts w:ascii="Times New Roman" w:eastAsia="Times New Roman" w:hAnsi="Times New Roman" w:cs="Times New Roman"/>
-          <w:b/>
-          <w:bCs/>
-          <w:sz w:val="36"/>
-          <w:szCs w:val="36"/>
-        </w:rPr>
-        <w:t>6.3 Execution Mode</w:t>
-      </w:r>
-    </w:p>
-    <w:p>
-      <w:pPr>
-        <w:pStyle w:val="NormalWeb"/>
-      </w:pPr>
-      <w:r>
-        <w:t>The system supports:</w:t>
-      </w:r>
-    </w:p>
-    <w:p>
-      <w:pPr>
-        <w:numPr>
-          <w:ilvl w:val="0"/>
-          <w:numId w:val="19"/>
-        </w:numPr>
-        <w:spacing w:before="100" w:beforeAutospacing="1" w:after="100" w:afterAutospacing="1" w:line="240" w:lineRule="auto"/>
-      </w:pPr>
-      <w:r>
-        <w:t xml:space="preserve">on-demand predictions through the FastAPI API, </w:t>
-      </w:r>
-    </w:p>
-    <w:p>
-      <w:pPr>
-        <w:numPr>
-          <w:ilvl w:val="0"/>
-          <w:numId w:val="19"/>
-        </w:numPr>
-        <w:spacing w:before="100" w:beforeAutospacing="1" w:after="100" w:afterAutospacing="1" w:line="240" w:lineRule="auto"/>
-      </w:pPr>
-      <w:r>
-        <w:t xml:space="preserve">interactive user predictions through the Streamlit frontend, </w:t>
-      </w:r>
-    </w:p>
-    <w:p>
-      <w:pPr>
-        <w:numPr>
-          <w:ilvl w:val="0"/>
-          <w:numId w:val="19"/>
-        </w:numPr>
-        <w:spacing w:before="100" w:beforeAutospacing="1" w:after="100" w:afterAutospacing="1" w:line="240" w:lineRule="auto"/>
-      </w:pPr>
-      <w:r>
-        <w:t>continuous execution through Docker container deployment.</w:t>
-      </w:r>
-    </w:p>
-    <w:p>
-      <w:pPr>
+          <w:kern w:val="36"/>
+          <w:sz w:val="48"/>
+          <w:szCs w:val="48"/>
+        </w:rPr>
+      </w:pPr>
+    </w:p>
+    <w:p>
+      <w:pPr>
+        <w:spacing w:before="100" w:beforeAutospacing="1" w:after="100" w:afterAutospacing="1" w:line="240" w:lineRule="auto"/>
+        <w:outlineLvl w:val="0"/>
         <w:rPr>
           <w:rFonts w:ascii="Times New Roman" w:eastAsia="Times New Roman" w:hAnsi="Times New Roman" w:cs="Times New Roman"/>
           <w:b/>
@@ -3163,7 +2413,319 @@
           <w:sz w:val="44"/>
           <w:szCs w:val="44"/>
         </w:rPr>
-        <w:br w:type="page"/>
+        <w:t>5. Artifact Collection and Storage</w:t>
+      </w:r>
+    </w:p>
+    <w:p>
+      <w:pPr>
+        <w:spacing w:before="100" w:beforeAutospacing="1" w:after="100" w:afterAutospacing="1" w:line="240" w:lineRule="auto"/>
+        <w:rPr>
+          <w:rFonts w:ascii="Times New Roman" w:eastAsia="Times New Roman" w:hAnsi="Times New Roman" w:cs="Times New Roman"/>
+          <w:sz w:val="24"/>
+          <w:szCs w:val="24"/>
+        </w:rPr>
+      </w:pPr>
+      <w:r>
+        <w:rPr>
+          <w:rFonts w:ascii="Times New Roman" w:hAnsi="Times New Roman" w:cs="Times New Roman"/>
+          <w:sz w:val="24"/>
+          <w:szCs w:val="24"/>
+        </w:rPr>
+        <w:t>Proper artifact management improves traceability and reproducibility throughout the machine learning lifecycle. By keeping track of datasets, processed files, model versions, and logs, it becomes easier to understand how results were produced and to repeat the same workflow when needed. This is an important requirement in production systems, where reliability, consistency, and the ability to troubleshoot issues are essential.</w:t>
+      </w:r>
+      <w:r>
+        <w:rPr>
+          <w:rFonts w:ascii="Times New Roman" w:hAnsi="Times New Roman" w:cs="Times New Roman"/>
+        </w:rPr>
+        <w:t xml:space="preserve"> </w:t>
+      </w:r>
+      <w:r>
+        <w:rPr>
+          <w:rFonts w:ascii="Times New Roman" w:hAnsi="Times New Roman" w:cs="Times New Roman"/>
+          <w:sz w:val="24"/>
+          <w:szCs w:val="24"/>
+        </w:rPr>
+        <w:t>(Schlegel &amp; Sattler, 2022)</w:t>
+      </w:r>
+    </w:p>
+    <w:p>
+      <w:pPr>
+        <w:spacing w:before="100" w:beforeAutospacing="1" w:after="100" w:afterAutospacing="1" w:line="240" w:lineRule="auto"/>
+        <w:rPr>
+          <w:rFonts w:ascii="Times New Roman" w:eastAsia="Times New Roman" w:hAnsi="Times New Roman" w:cs="Times New Roman"/>
+          <w:sz w:val="24"/>
+          <w:szCs w:val="24"/>
+        </w:rPr>
+      </w:pPr>
+      <w:r>
+        <w:rPr>
+          <w:rFonts w:ascii="Times New Roman" w:eastAsia="Times New Roman" w:hAnsi="Times New Roman" w:cs="Times New Roman"/>
+          <w:sz w:val="24"/>
+          <w:szCs w:val="24"/>
+        </w:rPr>
+        <w:t>Artifacts are stored in a structured directory:</w:t>
+      </w:r>
+    </w:p>
+    <w:p>
+      <w:pPr>
+        <w:numPr>
+          <w:ilvl w:val="0"/>
+          <w:numId w:val="11"/>
+        </w:numPr>
+        <w:spacing w:before="100" w:beforeAutospacing="1" w:after="100" w:afterAutospacing="1" w:line="240" w:lineRule="auto"/>
+        <w:rPr>
+          <w:rFonts w:ascii="Times New Roman" w:eastAsia="Times New Roman" w:hAnsi="Times New Roman" w:cs="Times New Roman"/>
+          <w:sz w:val="24"/>
+          <w:szCs w:val="24"/>
+        </w:rPr>
+      </w:pPr>
+      <w:r>
+        <w:rPr>
+          <w:rFonts w:ascii="Times New Roman" w:eastAsia="Times New Roman" w:hAnsi="Times New Roman" w:cs="Times New Roman"/>
+          <w:sz w:val="24"/>
+          <w:szCs w:val="24"/>
+        </w:rPr>
+        <w:t xml:space="preserve">raw data (historical, new) </w:t>
+      </w:r>
+    </w:p>
+    <w:p>
+      <w:pPr>
+        <w:numPr>
+          <w:ilvl w:val="0"/>
+          <w:numId w:val="11"/>
+        </w:numPr>
+        <w:spacing w:before="100" w:beforeAutospacing="1" w:after="100" w:afterAutospacing="1" w:line="240" w:lineRule="auto"/>
+        <w:rPr>
+          <w:rFonts w:ascii="Times New Roman" w:eastAsia="Times New Roman" w:hAnsi="Times New Roman" w:cs="Times New Roman"/>
+          <w:sz w:val="24"/>
+          <w:szCs w:val="24"/>
+        </w:rPr>
+      </w:pPr>
+      <w:r>
+        <w:rPr>
+          <w:rFonts w:ascii="Times New Roman" w:eastAsia="Times New Roman" w:hAnsi="Times New Roman" w:cs="Times New Roman"/>
+          <w:sz w:val="24"/>
+          <w:szCs w:val="24"/>
+        </w:rPr>
+        <w:t xml:space="preserve">processed data </w:t>
+      </w:r>
+    </w:p>
+    <w:p>
+      <w:pPr>
+        <w:numPr>
+          <w:ilvl w:val="0"/>
+          <w:numId w:val="11"/>
+        </w:numPr>
+        <w:spacing w:before="100" w:beforeAutospacing="1" w:after="100" w:afterAutospacing="1" w:line="240" w:lineRule="auto"/>
+        <w:rPr>
+          <w:rFonts w:ascii="Times New Roman" w:eastAsia="Times New Roman" w:hAnsi="Times New Roman" w:cs="Times New Roman"/>
+          <w:sz w:val="24"/>
+          <w:szCs w:val="24"/>
+        </w:rPr>
+      </w:pPr>
+      <w:r>
+        <w:rPr>
+          <w:rFonts w:ascii="Times New Roman" w:eastAsia="Times New Roman" w:hAnsi="Times New Roman" w:cs="Times New Roman"/>
+          <w:sz w:val="24"/>
+          <w:szCs w:val="24"/>
+        </w:rPr>
+        <w:t>trained model (</w:t>
+      </w:r>
+      <w:proofErr w:type="spellStart"/>
+      <w:r>
+        <w:rPr>
+          <w:rFonts w:ascii="Times New Roman" w:eastAsia="Times New Roman" w:hAnsi="Times New Roman" w:cs="Times New Roman"/>
+          <w:sz w:val="24"/>
+          <w:szCs w:val="24"/>
+        </w:rPr>
+        <w:t>model.pkl</w:t>
+      </w:r>
+      <w:proofErr w:type="spellEnd"/>
+      <w:r>
+        <w:rPr>
+          <w:rFonts w:ascii="Times New Roman" w:eastAsia="Times New Roman" w:hAnsi="Times New Roman" w:cs="Times New Roman"/>
+          <w:sz w:val="24"/>
+          <w:szCs w:val="24"/>
+        </w:rPr>
+        <w:t xml:space="preserve">) </w:t>
+      </w:r>
+    </w:p>
+    <w:p>
+      <w:pPr>
+        <w:numPr>
+          <w:ilvl w:val="0"/>
+          <w:numId w:val="11"/>
+        </w:numPr>
+        <w:spacing w:before="100" w:beforeAutospacing="1" w:after="100" w:afterAutospacing="1" w:line="240" w:lineRule="auto"/>
+        <w:rPr>
+          <w:rFonts w:ascii="Times New Roman" w:eastAsia="Times New Roman" w:hAnsi="Times New Roman" w:cs="Times New Roman"/>
+          <w:sz w:val="24"/>
+          <w:szCs w:val="24"/>
+        </w:rPr>
+      </w:pPr>
+      <w:r>
+        <w:rPr>
+          <w:rFonts w:ascii="Times New Roman" w:eastAsia="Times New Roman" w:hAnsi="Times New Roman" w:cs="Times New Roman"/>
+          <w:sz w:val="24"/>
+          <w:szCs w:val="24"/>
+        </w:rPr>
+        <w:t>feature schema (</w:t>
+      </w:r>
+      <w:proofErr w:type="spellStart"/>
+      <w:r>
+        <w:rPr>
+          <w:rFonts w:ascii="Times New Roman" w:eastAsia="Times New Roman" w:hAnsi="Times New Roman" w:cs="Times New Roman"/>
+          <w:sz w:val="24"/>
+          <w:szCs w:val="24"/>
+        </w:rPr>
+        <w:t>columns.pkl</w:t>
+      </w:r>
+      <w:proofErr w:type="spellEnd"/>
+      <w:r>
+        <w:rPr>
+          <w:rFonts w:ascii="Times New Roman" w:eastAsia="Times New Roman" w:hAnsi="Times New Roman" w:cs="Times New Roman"/>
+          <w:sz w:val="24"/>
+          <w:szCs w:val="24"/>
+        </w:rPr>
+        <w:t xml:space="preserve">) </w:t>
+      </w:r>
+    </w:p>
+    <w:p>
+      <w:pPr>
+        <w:numPr>
+          <w:ilvl w:val="0"/>
+          <w:numId w:val="11"/>
+        </w:numPr>
+        <w:spacing w:before="100" w:beforeAutospacing="1" w:after="100" w:afterAutospacing="1" w:line="240" w:lineRule="auto"/>
+        <w:rPr>
+          <w:rFonts w:ascii="Times New Roman" w:eastAsia="Times New Roman" w:hAnsi="Times New Roman" w:cs="Times New Roman"/>
+          <w:sz w:val="24"/>
+          <w:szCs w:val="24"/>
+        </w:rPr>
+      </w:pPr>
+      <w:r>
+        <w:rPr>
+          <w:rFonts w:ascii="Times New Roman" w:eastAsia="Times New Roman" w:hAnsi="Times New Roman" w:cs="Times New Roman"/>
+          <w:sz w:val="24"/>
+          <w:szCs w:val="24"/>
+        </w:rPr>
+        <w:t xml:space="preserve">evaluation metrics </w:t>
+      </w:r>
+    </w:p>
+    <w:p>
+      <w:pPr>
+        <w:numPr>
+          <w:ilvl w:val="0"/>
+          <w:numId w:val="11"/>
+        </w:numPr>
+        <w:spacing w:before="100" w:beforeAutospacing="1" w:after="100" w:afterAutospacing="1" w:line="240" w:lineRule="auto"/>
+        <w:rPr>
+          <w:rFonts w:ascii="Times New Roman" w:eastAsia="Times New Roman" w:hAnsi="Times New Roman" w:cs="Times New Roman"/>
+          <w:sz w:val="24"/>
+          <w:szCs w:val="24"/>
+        </w:rPr>
+      </w:pPr>
+      <w:r>
+        <w:rPr>
+          <w:rFonts w:ascii="Times New Roman" w:eastAsia="Times New Roman" w:hAnsi="Times New Roman" w:cs="Times New Roman"/>
+          <w:sz w:val="24"/>
+          <w:szCs w:val="24"/>
+        </w:rPr>
+        <w:t xml:space="preserve">logs </w:t>
+      </w:r>
+    </w:p>
+    <w:p>
+      <w:pPr>
+        <w:spacing w:before="100" w:beforeAutospacing="1" w:after="100" w:afterAutospacing="1" w:line="240" w:lineRule="auto"/>
+        <w:rPr>
+          <w:rFonts w:ascii="Times New Roman" w:eastAsia="Times New Roman" w:hAnsi="Times New Roman" w:cs="Times New Roman"/>
+          <w:sz w:val="24"/>
+          <w:szCs w:val="24"/>
+        </w:rPr>
+      </w:pPr>
+      <w:r>
+        <w:rPr>
+          <w:rFonts w:ascii="Times New Roman" w:eastAsia="Times New Roman" w:hAnsi="Times New Roman" w:cs="Times New Roman"/>
+          <w:sz w:val="24"/>
+          <w:szCs w:val="24"/>
+        </w:rPr>
+        <w:t>Why important:</w:t>
+      </w:r>
+      <w:r>
+        <w:rPr>
+          <w:rFonts w:ascii="Times New Roman" w:eastAsia="Times New Roman" w:hAnsi="Times New Roman" w:cs="Times New Roman"/>
+          <w:sz w:val="24"/>
+          <w:szCs w:val="24"/>
+        </w:rPr>
+        <w:br/>
+        <w:t>Artifact storage enables:</w:t>
+      </w:r>
+    </w:p>
+    <w:p>
+      <w:pPr>
+        <w:numPr>
+          <w:ilvl w:val="0"/>
+          <w:numId w:val="12"/>
+        </w:numPr>
+        <w:spacing w:before="100" w:beforeAutospacing="1" w:after="100" w:afterAutospacing="1" w:line="240" w:lineRule="auto"/>
+        <w:rPr>
+          <w:rFonts w:ascii="Times New Roman" w:eastAsia="Times New Roman" w:hAnsi="Times New Roman" w:cs="Times New Roman"/>
+          <w:sz w:val="24"/>
+          <w:szCs w:val="24"/>
+        </w:rPr>
+      </w:pPr>
+      <w:r>
+        <w:rPr>
+          <w:rFonts w:ascii="Times New Roman" w:eastAsia="Times New Roman" w:hAnsi="Times New Roman" w:cs="Times New Roman"/>
+          <w:sz w:val="24"/>
+          <w:szCs w:val="24"/>
+        </w:rPr>
+        <w:t xml:space="preserve">reproducibility </w:t>
+      </w:r>
+    </w:p>
+    <w:p>
+      <w:pPr>
+        <w:numPr>
+          <w:ilvl w:val="0"/>
+          <w:numId w:val="12"/>
+        </w:numPr>
+        <w:spacing w:before="100" w:beforeAutospacing="1" w:after="100" w:afterAutospacing="1" w:line="240" w:lineRule="auto"/>
+        <w:rPr>
+          <w:rFonts w:ascii="Times New Roman" w:eastAsia="Times New Roman" w:hAnsi="Times New Roman" w:cs="Times New Roman"/>
+          <w:sz w:val="24"/>
+          <w:szCs w:val="24"/>
+        </w:rPr>
+      </w:pPr>
+      <w:r>
+        <w:rPr>
+          <w:rFonts w:ascii="Times New Roman" w:eastAsia="Times New Roman" w:hAnsi="Times New Roman" w:cs="Times New Roman"/>
+          <w:sz w:val="24"/>
+          <w:szCs w:val="24"/>
+        </w:rPr>
+        <w:lastRenderedPageBreak/>
+        <w:t xml:space="preserve">debugging </w:t>
+      </w:r>
+    </w:p>
+    <w:p>
+      <w:pPr>
+        <w:numPr>
+          <w:ilvl w:val="0"/>
+          <w:numId w:val="12"/>
+        </w:numPr>
+        <w:spacing w:before="100" w:beforeAutospacing="1" w:after="100" w:afterAutospacing="1" w:line="240" w:lineRule="auto"/>
+        <w:rPr>
+          <w:rFonts w:ascii="Times New Roman" w:eastAsia="Times New Roman" w:hAnsi="Times New Roman" w:cs="Times New Roman"/>
+          <w:sz w:val="24"/>
+          <w:szCs w:val="24"/>
+        </w:rPr>
+      </w:pPr>
+      <w:r>
+        <w:rPr>
+          <w:rFonts w:ascii="Times New Roman" w:eastAsia="Times New Roman" w:hAnsi="Times New Roman" w:cs="Times New Roman"/>
+          <w:sz w:val="24"/>
+          <w:szCs w:val="24"/>
+        </w:rPr>
+        <w:t xml:space="preserve">auditability </w:t>
       </w:r>
     </w:p>
     <w:p>
@@ -3188,134 +2750,178 @@
           <w:sz w:val="44"/>
           <w:szCs w:val="44"/>
         </w:rPr>
-        <w:lastRenderedPageBreak/>
-        <w:t>7.</w:t>
-      </w:r>
-      <w:r>
+        <w:t>6. Deployment Setup</w:t>
+      </w:r>
+    </w:p>
+    <w:p>
+      <w:pPr>
+        <w:spacing w:before="100" w:beforeAutospacing="1" w:after="100" w:afterAutospacing="1" w:line="240" w:lineRule="auto"/>
+        <w:outlineLvl w:val="1"/>
         <w:rPr>
           <w:rFonts w:ascii="Times New Roman" w:eastAsia="Times New Roman" w:hAnsi="Times New Roman" w:cs="Times New Roman"/>
           <w:b/>
           <w:bCs/>
-          <w:kern w:val="36"/>
-          <w:sz w:val="44"/>
-          <w:szCs w:val="44"/>
-        </w:rPr>
-        <w:t xml:space="preserve"> Frontend</w:t>
-      </w:r>
-    </w:p>
-    <w:p>
-      <w:pPr>
-        <w:pStyle w:val="NormalWeb"/>
-      </w:pPr>
-      <w:r>
-        <w:t>A lightweight interactive frontend was implemented using Streamlit to improve usability and demonstrate end-user interaction.</w:t>
-      </w:r>
-    </w:p>
-    <w:p>
-      <w:pPr>
-        <w:pStyle w:val="NormalWeb"/>
-      </w:pPr>
-      <w:r>
-        <w:t>The frontend allows users to:</w:t>
+          <w:sz w:val="36"/>
+          <w:szCs w:val="36"/>
+        </w:rPr>
+      </w:pPr>
+      <w:r>
+        <w:rPr>
+          <w:rFonts w:ascii="Times New Roman" w:eastAsia="Times New Roman" w:hAnsi="Times New Roman" w:cs="Times New Roman"/>
+          <w:b/>
+          <w:bCs/>
+          <w:sz w:val="36"/>
+          <w:szCs w:val="36"/>
+        </w:rPr>
+        <w:t>6.1 API Deployment</w:t>
+      </w:r>
+    </w:p>
+    <w:p>
+      <w:pPr>
+        <w:spacing w:before="100" w:beforeAutospacing="1" w:after="100" w:afterAutospacing="1" w:line="240" w:lineRule="auto"/>
+        <w:rPr>
+          <w:rFonts w:ascii="Times New Roman" w:eastAsia="Times New Roman" w:hAnsi="Times New Roman" w:cs="Times New Roman"/>
+          <w:sz w:val="24"/>
+          <w:szCs w:val="24"/>
+        </w:rPr>
+      </w:pPr>
+      <w:r>
+        <w:rPr>
+          <w:rFonts w:ascii="Times New Roman" w:eastAsia="Times New Roman" w:hAnsi="Times New Roman" w:cs="Times New Roman"/>
+          <w:sz w:val="24"/>
+          <w:szCs w:val="24"/>
+        </w:rPr>
+        <w:t>The model is deployed using FastAPI, exposing a /predict endpoint.</w:t>
+      </w:r>
+    </w:p>
+    <w:p>
+      <w:pPr>
+        <w:spacing w:before="100" w:beforeAutospacing="1" w:after="100" w:afterAutospacing="1" w:line="240" w:lineRule="auto"/>
+        <w:rPr>
+          <w:rFonts w:ascii="Times New Roman" w:eastAsia="Times New Roman" w:hAnsi="Times New Roman" w:cs="Times New Roman"/>
+          <w:sz w:val="24"/>
+          <w:szCs w:val="24"/>
+        </w:rPr>
+      </w:pPr>
+      <w:r>
+        <w:rPr>
+          <w:rFonts w:ascii="Times New Roman" w:eastAsia="Times New Roman" w:hAnsi="Times New Roman" w:cs="Times New Roman"/>
+          <w:sz w:val="24"/>
+          <w:szCs w:val="24"/>
+        </w:rPr>
+        <w:t>Why FastAPI:</w:t>
       </w:r>
     </w:p>
     <w:p>
       <w:pPr>
         <w:numPr>
           <w:ilvl w:val="0"/>
-          <w:numId w:val="17"/>
+          <w:numId w:val="13"/>
         </w:numPr>
         <w:spacing w:before="100" w:beforeAutospacing="1" w:after="100" w:afterAutospacing="1" w:line="240" w:lineRule="auto"/>
         <w:rPr>
-          <w:rFonts w:ascii="Times New Roman" w:hAnsi="Times New Roman" w:cs="Times New Roman"/>
-          <w:sz w:val="24"/>
-          <w:szCs w:val="24"/>
-        </w:rPr>
-      </w:pPr>
-      <w:r>
-        <w:rPr>
-          <w:rFonts w:ascii="Times New Roman" w:hAnsi="Times New Roman" w:cs="Times New Roman"/>
-          <w:sz w:val="24"/>
-          <w:szCs w:val="24"/>
-        </w:rPr>
-        <w:t xml:space="preserve">enter customer details through a simple form, </w:t>
+          <w:rFonts w:ascii="Times New Roman" w:eastAsia="Times New Roman" w:hAnsi="Times New Roman" w:cs="Times New Roman"/>
+          <w:sz w:val="24"/>
+          <w:szCs w:val="24"/>
+        </w:rPr>
+      </w:pPr>
+      <w:r>
+        <w:rPr>
+          <w:rFonts w:ascii="Times New Roman" w:eastAsia="Times New Roman" w:hAnsi="Times New Roman" w:cs="Times New Roman"/>
+          <w:sz w:val="24"/>
+          <w:szCs w:val="24"/>
+        </w:rPr>
+        <w:t xml:space="preserve">lightweight </w:t>
       </w:r>
     </w:p>
     <w:p>
       <w:pPr>
         <w:numPr>
           <w:ilvl w:val="0"/>
-          <w:numId w:val="17"/>
+          <w:numId w:val="13"/>
         </w:numPr>
         <w:spacing w:before="100" w:beforeAutospacing="1" w:after="100" w:afterAutospacing="1" w:line="240" w:lineRule="auto"/>
         <w:rPr>
-          <w:rFonts w:ascii="Times New Roman" w:hAnsi="Times New Roman" w:cs="Times New Roman"/>
-          <w:sz w:val="24"/>
-          <w:szCs w:val="24"/>
-        </w:rPr>
-      </w:pPr>
-      <w:r>
-        <w:rPr>
-          <w:rFonts w:ascii="Times New Roman" w:hAnsi="Times New Roman" w:cs="Times New Roman"/>
-          <w:sz w:val="24"/>
-          <w:szCs w:val="24"/>
-        </w:rPr>
-        <w:t xml:space="preserve">send data to the FastAPI backend, </w:t>
+          <w:rFonts w:ascii="Times New Roman" w:eastAsia="Times New Roman" w:hAnsi="Times New Roman" w:cs="Times New Roman"/>
+          <w:sz w:val="24"/>
+          <w:szCs w:val="24"/>
+        </w:rPr>
+      </w:pPr>
+      <w:r>
+        <w:rPr>
+          <w:rFonts w:ascii="Times New Roman" w:eastAsia="Times New Roman" w:hAnsi="Times New Roman" w:cs="Times New Roman"/>
+          <w:sz w:val="24"/>
+          <w:szCs w:val="24"/>
+        </w:rPr>
+        <w:t xml:space="preserve">fast </w:t>
       </w:r>
     </w:p>
     <w:p>
       <w:pPr>
         <w:numPr>
           <w:ilvl w:val="0"/>
-          <w:numId w:val="17"/>
+          <w:numId w:val="13"/>
         </w:numPr>
         <w:spacing w:before="100" w:beforeAutospacing="1" w:after="100" w:afterAutospacing="1" w:line="240" w:lineRule="auto"/>
         <w:rPr>
-          <w:rFonts w:ascii="Times New Roman" w:hAnsi="Times New Roman" w:cs="Times New Roman"/>
-          <w:sz w:val="24"/>
-          <w:szCs w:val="24"/>
-        </w:rPr>
-      </w:pPr>
-      <w:r>
-        <w:rPr>
-          <w:rFonts w:ascii="Times New Roman" w:hAnsi="Times New Roman" w:cs="Times New Roman"/>
-          <w:sz w:val="24"/>
-          <w:szCs w:val="24"/>
-        </w:rPr>
-        <w:t xml:space="preserve">receive real-time churn predictions. </w:t>
-      </w:r>
-    </w:p>
-    <w:p>
-      <w:pPr>
-        <w:pStyle w:val="NormalWeb"/>
-      </w:pPr>
-      <w:r>
-        <w:t xml:space="preserve">The frontend communicates with the deployed FastAPI API through the </w:t>
-      </w:r>
-      <w:r>
-        <w:rPr>
-          <w:rStyle w:val="HTMLCode"/>
-          <w:rFonts w:ascii="Times New Roman" w:hAnsi="Times New Roman" w:cs="Times New Roman"/>
-          <w:sz w:val="24"/>
-          <w:szCs w:val="24"/>
-        </w:rPr>
-        <w:t>/predict</w:t>
-      </w:r>
-      <w:r>
-        <w:t xml:space="preserve"> endpoint.</w:t>
-      </w:r>
-    </w:p>
-    <w:p>
-      <w:pPr>
-        <w:pStyle w:val="NormalWeb"/>
+          <w:rFonts w:ascii="Times New Roman" w:eastAsia="Times New Roman" w:hAnsi="Times New Roman" w:cs="Times New Roman"/>
+          <w:sz w:val="24"/>
+          <w:szCs w:val="24"/>
+        </w:rPr>
+      </w:pPr>
+      <w:r>
+        <w:rPr>
+          <w:rFonts w:ascii="Times New Roman" w:eastAsia="Times New Roman" w:hAnsi="Times New Roman" w:cs="Times New Roman"/>
+          <w:sz w:val="24"/>
+          <w:szCs w:val="24"/>
+        </w:rPr>
+        <w:t xml:space="preserve">built-in documentation (Swagger) </w:t>
+      </w:r>
+    </w:p>
+    <w:p>
+      <w:pPr>
+        <w:numPr>
+          <w:ilvl w:val="0"/>
+          <w:numId w:val="13"/>
+        </w:numPr>
+        <w:spacing w:before="100" w:beforeAutospacing="1" w:after="100" w:afterAutospacing="1" w:line="240" w:lineRule="auto"/>
+        <w:rPr>
+          <w:rFonts w:ascii="Times New Roman" w:eastAsia="Times New Roman" w:hAnsi="Times New Roman" w:cs="Times New Roman"/>
+          <w:sz w:val="24"/>
+          <w:szCs w:val="24"/>
+        </w:rPr>
+      </w:pPr>
+      <w:r>
+        <w:rPr>
+          <w:rFonts w:ascii="Times New Roman" w:eastAsia="Times New Roman" w:hAnsi="Times New Roman" w:cs="Times New Roman"/>
+          <w:sz w:val="24"/>
+          <w:szCs w:val="24"/>
+        </w:rPr>
+        <w:t xml:space="preserve">easy integration with ML models </w:t>
+      </w:r>
+    </w:p>
+    <w:p>
+      <w:pPr>
+        <w:spacing w:after="0" w:line="240" w:lineRule="auto"/>
         <w:jc w:val="center"/>
-      </w:pPr>
-      <w:r>
+        <w:rPr>
+          <w:rFonts w:ascii="Times New Roman" w:eastAsia="Times New Roman" w:hAnsi="Times New Roman" w:cs="Times New Roman"/>
+          <w:sz w:val="24"/>
+          <w:szCs w:val="24"/>
+        </w:rPr>
+      </w:pPr>
+      <w:r>
+        <w:rPr>
+          <w:rFonts w:ascii="Times New Roman" w:eastAsia="Times New Roman" w:hAnsi="Times New Roman" w:cs="Times New Roman"/>
+          <w:noProof/>
+          <w:sz w:val="24"/>
+          <w:szCs w:val="24"/>
+        </w:rPr>
         <w:drawing>
-          <wp:inline distT="0" distB="0" distL="0" distR="0" wp14:anchorId="1F469FC9" wp14:editId="421A64F1">
-            <wp:extent cx="5467350" cy="3182620"/>
-            <wp:effectExtent l="0" t="0" r="0" b="0"/>
-            <wp:docPr id="1" name="Picture 1"/>
+          <wp:inline distT="0" distB="0" distL="0" distR="0" wp14:anchorId="6CB4DE71" wp14:editId="5DF02589">
+            <wp:extent cx="5480050" cy="3143885"/>
+            <wp:effectExtent l="0" t="0" r="6350" b="0"/>
+            <wp:docPr id="2" name="Picture 2"/>
             <wp:cNvGraphicFramePr>
               <a:graphicFrameLocks xmlns:a="http://schemas.openxmlformats.org/drawingml/2006/main" noChangeAspect="1"/>
             </wp:cNvGraphicFramePr>
@@ -3335,7 +2941,7 @@
                   <pic:spPr>
                     <a:xfrm>
                       <a:off x="0" y="0"/>
-                      <a:ext cx="5467350" cy="3182620"/>
+                      <a:ext cx="5480050" cy="3143885"/>
                     </a:xfrm>
                     <a:prstGeom prst="rect">
                       <a:avLst/>
@@ -3350,96 +2956,278 @@
     </w:p>
     <w:p>
       <w:pPr>
-        <w:pStyle w:val="NormalWeb"/>
+        <w:spacing w:after="0" w:line="240" w:lineRule="auto"/>
         <w:jc w:val="center"/>
-      </w:pPr>
-      <w:r>
+        <w:rPr>
+          <w:rFonts w:ascii="Times New Roman" w:eastAsia="Times New Roman" w:hAnsi="Times New Roman" w:cs="Times New Roman"/>
+          <w:sz w:val="24"/>
+          <w:szCs w:val="24"/>
+        </w:rPr>
+      </w:pPr>
+      <w:r>
+        <w:rPr>
+          <w:rFonts w:ascii="Times New Roman" w:hAnsi="Times New Roman" w:cs="Times New Roman"/>
+          <w:sz w:val="24"/>
+          <w:szCs w:val="24"/>
+        </w:rPr>
         <w:t>Figure 3</w:t>
       </w:r>
       <w:r>
-        <w:t>: Streamlit frontend used for customer churn prediction.</w:t>
-      </w:r>
-    </w:p>
-    <w:p>
-      <w:pPr>
-        <w:pStyle w:val="Heading3"/>
-        <w:rPr>
-          <w:rFonts w:ascii="Times New Roman" w:hAnsi="Times New Roman" w:cs="Times New Roman"/>
-          <w:color w:val="auto"/>
-        </w:rPr>
-      </w:pPr>
-      <w:r>
-        <w:rPr>
-          <w:rFonts w:ascii="Times New Roman" w:hAnsi="Times New Roman" w:cs="Times New Roman"/>
-          <w:color w:val="auto"/>
-        </w:rPr>
-        <w:t>Why Streamlit:</w:t>
+        <w:rPr>
+          <w:rFonts w:ascii="Times New Roman" w:hAnsi="Times New Roman" w:cs="Times New Roman"/>
+          <w:sz w:val="24"/>
+          <w:szCs w:val="24"/>
+        </w:rPr>
+        <w:t>: FastAPI Swagger UI showing successful churn prediction.</w:t>
+      </w:r>
+    </w:p>
+    <w:p>
+      <w:pPr>
+        <w:spacing w:before="100" w:beforeAutospacing="1" w:after="100" w:afterAutospacing="1" w:line="240" w:lineRule="auto"/>
+        <w:outlineLvl w:val="1"/>
+        <w:rPr>
+          <w:rFonts w:ascii="Times New Roman" w:eastAsia="Times New Roman" w:hAnsi="Times New Roman" w:cs="Times New Roman"/>
+          <w:b/>
+          <w:bCs/>
+          <w:sz w:val="36"/>
+          <w:szCs w:val="36"/>
+        </w:rPr>
+      </w:pPr>
+      <w:r>
+        <w:rPr>
+          <w:rFonts w:ascii="Times New Roman" w:eastAsia="Times New Roman" w:hAnsi="Times New Roman" w:cs="Times New Roman"/>
+          <w:b/>
+          <w:bCs/>
+          <w:sz w:val="36"/>
+          <w:szCs w:val="36"/>
+        </w:rPr>
+        <w:t>6.2 Docker Deployment</w:t>
+      </w:r>
+    </w:p>
+    <w:p>
+      <w:pPr>
+        <w:spacing w:before="100" w:beforeAutospacing="1" w:after="100" w:afterAutospacing="1" w:line="240" w:lineRule="auto"/>
+        <w:rPr>
+          <w:rFonts w:ascii="Times New Roman" w:eastAsia="Times New Roman" w:hAnsi="Times New Roman" w:cs="Times New Roman"/>
+          <w:sz w:val="24"/>
+          <w:szCs w:val="24"/>
+        </w:rPr>
+      </w:pPr>
+      <w:r>
+        <w:rPr>
+          <w:rFonts w:ascii="Times New Roman" w:eastAsia="Times New Roman" w:hAnsi="Times New Roman" w:cs="Times New Roman"/>
+          <w:sz w:val="24"/>
+          <w:szCs w:val="24"/>
+        </w:rPr>
+        <w:t>The entire system is containerized using Docker.</w:t>
+      </w:r>
+    </w:p>
+    <w:p>
+      <w:pPr>
+        <w:spacing w:before="100" w:beforeAutospacing="1" w:after="100" w:afterAutospacing="1" w:line="240" w:lineRule="auto"/>
+        <w:rPr>
+          <w:rFonts w:ascii="Times New Roman" w:eastAsia="Times New Roman" w:hAnsi="Times New Roman" w:cs="Times New Roman"/>
+          <w:sz w:val="24"/>
+          <w:szCs w:val="24"/>
+        </w:rPr>
+      </w:pPr>
+      <w:r>
+        <w:rPr>
+          <w:rFonts w:ascii="Times New Roman" w:eastAsia="Times New Roman" w:hAnsi="Times New Roman" w:cs="Times New Roman"/>
+          <w:sz w:val="24"/>
+          <w:szCs w:val="24"/>
+        </w:rPr>
+        <w:t>Steps:</w:t>
       </w:r>
     </w:p>
     <w:p>
       <w:pPr>
         <w:numPr>
           <w:ilvl w:val="0"/>
-          <w:numId w:val="18"/>
+          <w:numId w:val="14"/>
         </w:numPr>
         <w:spacing w:before="100" w:beforeAutospacing="1" w:after="100" w:afterAutospacing="1" w:line="240" w:lineRule="auto"/>
         <w:rPr>
-          <w:rFonts w:ascii="Times New Roman" w:hAnsi="Times New Roman" w:cs="Times New Roman"/>
-          <w:sz w:val="24"/>
-          <w:szCs w:val="24"/>
-        </w:rPr>
-      </w:pPr>
-      <w:r>
-        <w:rPr>
-          <w:rFonts w:ascii="Times New Roman" w:hAnsi="Times New Roman" w:cs="Times New Roman"/>
-          <w:sz w:val="24"/>
-          <w:szCs w:val="24"/>
-        </w:rPr>
-        <w:t xml:space="preserve">simple and fast to develop, </w:t>
+          <w:rFonts w:ascii="Times New Roman" w:eastAsia="Times New Roman" w:hAnsi="Times New Roman" w:cs="Times New Roman"/>
+          <w:sz w:val="24"/>
+          <w:szCs w:val="24"/>
+        </w:rPr>
+      </w:pPr>
+      <w:r>
+        <w:rPr>
+          <w:rFonts w:ascii="Times New Roman" w:eastAsia="Times New Roman" w:hAnsi="Times New Roman" w:cs="Times New Roman"/>
+          <w:sz w:val="24"/>
+          <w:szCs w:val="24"/>
+        </w:rPr>
+        <w:t xml:space="preserve">build image </w:t>
       </w:r>
     </w:p>
     <w:p>
       <w:pPr>
         <w:numPr>
           <w:ilvl w:val="0"/>
-          <w:numId w:val="18"/>
+          <w:numId w:val="14"/>
         </w:numPr>
         <w:spacing w:before="100" w:beforeAutospacing="1" w:after="100" w:afterAutospacing="1" w:line="240" w:lineRule="auto"/>
         <w:rPr>
-          <w:rFonts w:ascii="Times New Roman" w:hAnsi="Times New Roman" w:cs="Times New Roman"/>
-          <w:sz w:val="24"/>
-          <w:szCs w:val="24"/>
-        </w:rPr>
-      </w:pPr>
-      <w:r>
-        <w:rPr>
-          <w:rFonts w:ascii="Times New Roman" w:hAnsi="Times New Roman" w:cs="Times New Roman"/>
-          <w:sz w:val="24"/>
-          <w:szCs w:val="24"/>
-        </w:rPr>
-        <w:t xml:space="preserve">easy integration with Python APIs, </w:t>
+          <w:rFonts w:ascii="Times New Roman" w:eastAsia="Times New Roman" w:hAnsi="Times New Roman" w:cs="Times New Roman"/>
+          <w:sz w:val="24"/>
+          <w:szCs w:val="24"/>
+        </w:rPr>
+      </w:pPr>
+      <w:r>
+        <w:rPr>
+          <w:rFonts w:ascii="Times New Roman" w:eastAsia="Times New Roman" w:hAnsi="Times New Roman" w:cs="Times New Roman"/>
+          <w:sz w:val="24"/>
+          <w:szCs w:val="24"/>
+        </w:rPr>
+        <w:t xml:space="preserve">run container </w:t>
       </w:r>
     </w:p>
     <w:p>
       <w:pPr>
         <w:numPr>
           <w:ilvl w:val="0"/>
-          <w:numId w:val="18"/>
+          <w:numId w:val="14"/>
         </w:numPr>
         <w:spacing w:before="100" w:beforeAutospacing="1" w:after="100" w:afterAutospacing="1" w:line="240" w:lineRule="auto"/>
         <w:rPr>
-          <w:rFonts w:ascii="Times New Roman" w:hAnsi="Times New Roman" w:cs="Times New Roman"/>
-          <w:sz w:val="24"/>
-          <w:szCs w:val="24"/>
-        </w:rPr>
-      </w:pPr>
-      <w:r>
-        <w:rPr>
-          <w:rFonts w:ascii="Times New Roman" w:hAnsi="Times New Roman" w:cs="Times New Roman"/>
-          <w:sz w:val="24"/>
-          <w:szCs w:val="24"/>
-        </w:rPr>
-        <w:t xml:space="preserve">suitable for demonstrating machine learning applications. </w:t>
+          <w:rFonts w:ascii="Times New Roman" w:eastAsia="Times New Roman" w:hAnsi="Times New Roman" w:cs="Times New Roman"/>
+          <w:sz w:val="24"/>
+          <w:szCs w:val="24"/>
+        </w:rPr>
+      </w:pPr>
+      <w:r>
+        <w:rPr>
+          <w:rFonts w:ascii="Times New Roman" w:eastAsia="Times New Roman" w:hAnsi="Times New Roman" w:cs="Times New Roman"/>
+          <w:sz w:val="24"/>
+          <w:szCs w:val="24"/>
+        </w:rPr>
+        <w:t xml:space="preserve">expose port 8000 </w:t>
+      </w:r>
+    </w:p>
+    <w:p>
+      <w:pPr>
+        <w:spacing w:before="100" w:beforeAutospacing="1" w:after="100" w:afterAutospacing="1" w:line="240" w:lineRule="auto"/>
+        <w:rPr>
+          <w:rFonts w:ascii="Times New Roman" w:eastAsia="Times New Roman" w:hAnsi="Times New Roman" w:cs="Times New Roman"/>
+          <w:sz w:val="24"/>
+          <w:szCs w:val="24"/>
+        </w:rPr>
+      </w:pPr>
+      <w:r>
+        <w:rPr>
+          <w:rFonts w:ascii="Times New Roman" w:eastAsia="Times New Roman" w:hAnsi="Times New Roman" w:cs="Times New Roman"/>
+          <w:sz w:val="24"/>
+          <w:szCs w:val="24"/>
+        </w:rPr>
+        <w:lastRenderedPageBreak/>
+        <w:t>Why Docker:</w:t>
+      </w:r>
+    </w:p>
+    <w:p>
+      <w:pPr>
+        <w:numPr>
+          <w:ilvl w:val="0"/>
+          <w:numId w:val="15"/>
+        </w:numPr>
+        <w:spacing w:before="100" w:beforeAutospacing="1" w:after="100" w:afterAutospacing="1" w:line="240" w:lineRule="auto"/>
+        <w:rPr>
+          <w:rFonts w:ascii="Times New Roman" w:eastAsia="Times New Roman" w:hAnsi="Times New Roman" w:cs="Times New Roman"/>
+          <w:sz w:val="24"/>
+          <w:szCs w:val="24"/>
+        </w:rPr>
+      </w:pPr>
+      <w:r>
+        <w:rPr>
+          <w:rFonts w:ascii="Times New Roman" w:eastAsia="Times New Roman" w:hAnsi="Times New Roman" w:cs="Times New Roman"/>
+          <w:sz w:val="24"/>
+          <w:szCs w:val="24"/>
+        </w:rPr>
+        <w:t xml:space="preserve">ensures </w:t>
+      </w:r>
+      <w:r>
+        <w:rPr>
+          <w:rFonts w:ascii="Times New Roman" w:eastAsia="Times New Roman" w:hAnsi="Times New Roman" w:cs="Times New Roman"/>
+          <w:sz w:val="24"/>
+          <w:szCs w:val="24"/>
+        </w:rPr>
+        <w:t>environmental</w:t>
+      </w:r>
+      <w:r>
+        <w:rPr>
+          <w:rFonts w:ascii="Times New Roman" w:eastAsia="Times New Roman" w:hAnsi="Times New Roman" w:cs="Times New Roman"/>
+          <w:sz w:val="24"/>
+          <w:szCs w:val="24"/>
+        </w:rPr>
+        <w:t xml:space="preserve"> consistency </w:t>
+      </w:r>
+    </w:p>
+    <w:p>
+      <w:pPr>
+        <w:numPr>
+          <w:ilvl w:val="0"/>
+          <w:numId w:val="15"/>
+        </w:numPr>
+        <w:spacing w:before="100" w:beforeAutospacing="1" w:after="100" w:afterAutospacing="1" w:line="240" w:lineRule="auto"/>
+        <w:rPr>
+          <w:rFonts w:ascii="Times New Roman" w:eastAsia="Times New Roman" w:hAnsi="Times New Roman" w:cs="Times New Roman"/>
+          <w:sz w:val="24"/>
+          <w:szCs w:val="24"/>
+        </w:rPr>
+      </w:pPr>
+      <w:r>
+        <w:rPr>
+          <w:rFonts w:ascii="Times New Roman" w:eastAsia="Times New Roman" w:hAnsi="Times New Roman" w:cs="Times New Roman"/>
+          <w:sz w:val="24"/>
+          <w:szCs w:val="24"/>
+        </w:rPr>
+        <w:t xml:space="preserve">simplifies deployment </w:t>
+      </w:r>
+    </w:p>
+    <w:p>
+      <w:pPr>
+        <w:numPr>
+          <w:ilvl w:val="0"/>
+          <w:numId w:val="15"/>
+        </w:numPr>
+        <w:spacing w:before="100" w:beforeAutospacing="1" w:after="100" w:afterAutospacing="1" w:line="240" w:lineRule="auto"/>
+        <w:rPr>
+          <w:rFonts w:ascii="Times New Roman" w:eastAsia="Times New Roman" w:hAnsi="Times New Roman" w:cs="Times New Roman"/>
+          <w:sz w:val="24"/>
+          <w:szCs w:val="24"/>
+        </w:rPr>
+      </w:pPr>
+      <w:r>
+        <w:rPr>
+          <w:rFonts w:ascii="Times New Roman" w:eastAsia="Times New Roman" w:hAnsi="Times New Roman" w:cs="Times New Roman"/>
+          <w:sz w:val="24"/>
+          <w:szCs w:val="24"/>
+        </w:rPr>
+        <w:t xml:space="preserve">supports reproducibility </w:t>
+      </w:r>
+    </w:p>
+    <w:p>
+      <w:pPr>
+        <w:spacing w:before="100" w:beforeAutospacing="1" w:after="100" w:afterAutospacing="1" w:line="240" w:lineRule="auto"/>
+        <w:outlineLvl w:val="1"/>
+        <w:rPr>
+          <w:rFonts w:ascii="Times New Roman" w:eastAsia="Times New Roman" w:hAnsi="Times New Roman" w:cs="Times New Roman"/>
+          <w:b/>
+          <w:bCs/>
+          <w:sz w:val="36"/>
+          <w:szCs w:val="36"/>
+        </w:rPr>
+      </w:pPr>
+      <w:r>
+        <w:rPr>
+          <w:rFonts w:ascii="Times New Roman" w:eastAsia="Times New Roman" w:hAnsi="Times New Roman" w:cs="Times New Roman"/>
+          <w:b/>
+          <w:bCs/>
+          <w:sz w:val="36"/>
+          <w:szCs w:val="36"/>
+        </w:rPr>
+        <w:t>6.3 Execution Mode</w:t>
       </w:r>
     </w:p>
     <w:p>
@@ -3447,19 +3235,62 @@
         <w:pStyle w:val="NormalWeb"/>
       </w:pPr>
       <w:r>
-        <w:t>This frontend improves the accessibility of the system and provides a more realistic deployment scenario.</w:t>
-      </w:r>
-    </w:p>
-    <w:p>
-      <w:pPr>
-        <w:spacing w:before="100" w:beforeAutospacing="1" w:after="100" w:afterAutospacing="1" w:line="240" w:lineRule="auto"/>
-        <w:outlineLvl w:val="0"/>
-        <w:rPr>
-          <w:rFonts w:ascii="Times New Roman" w:eastAsia="Times New Roman" w:hAnsi="Times New Roman" w:cs="Times New Roman"/>
-          <w:sz w:val="24"/>
-          <w:szCs w:val="24"/>
-        </w:rPr>
-      </w:pPr>
+        <w:t>The system supports:</w:t>
+      </w:r>
+    </w:p>
+    <w:p>
+      <w:pPr>
+        <w:numPr>
+          <w:ilvl w:val="0"/>
+          <w:numId w:val="19"/>
+        </w:numPr>
+        <w:spacing w:before="100" w:beforeAutospacing="1" w:after="100" w:afterAutospacing="1" w:line="240" w:lineRule="auto"/>
+        <w:rPr>
+          <w:rFonts w:ascii="Times New Roman" w:hAnsi="Times New Roman" w:cs="Times New Roman"/>
+        </w:rPr>
+      </w:pPr>
+      <w:r>
+        <w:rPr>
+          <w:rFonts w:ascii="Times New Roman" w:hAnsi="Times New Roman" w:cs="Times New Roman"/>
+        </w:rPr>
+        <w:t xml:space="preserve">on-demand predictions through the FastAPI API, </w:t>
+      </w:r>
+    </w:p>
+    <w:p>
+      <w:pPr>
+        <w:numPr>
+          <w:ilvl w:val="0"/>
+          <w:numId w:val="19"/>
+        </w:numPr>
+        <w:spacing w:before="100" w:beforeAutospacing="1" w:after="100" w:afterAutospacing="1" w:line="240" w:lineRule="auto"/>
+        <w:rPr>
+          <w:rFonts w:ascii="Times New Roman" w:hAnsi="Times New Roman" w:cs="Times New Roman"/>
+        </w:rPr>
+      </w:pPr>
+      <w:r>
+        <w:rPr>
+          <w:rFonts w:ascii="Times New Roman" w:hAnsi="Times New Roman" w:cs="Times New Roman"/>
+        </w:rPr>
+        <w:t xml:space="preserve">interactive user predictions through the Streamlit frontend, </w:t>
+      </w:r>
+    </w:p>
+    <w:p>
+      <w:pPr>
+        <w:numPr>
+          <w:ilvl w:val="0"/>
+          <w:numId w:val="19"/>
+        </w:numPr>
+        <w:spacing w:before="100" w:beforeAutospacing="1" w:after="100" w:afterAutospacing="1" w:line="240" w:lineRule="auto"/>
+        <w:rPr>
+          <w:rFonts w:ascii="Times New Roman" w:hAnsi="Times New Roman" w:cs="Times New Roman"/>
+        </w:rPr>
+      </w:pPr>
+      <w:r>
+        <w:rPr>
+          <w:rFonts w:ascii="Times New Roman" w:hAnsi="Times New Roman" w:cs="Times New Roman"/>
+        </w:rPr>
+        <w:t>continuous execution through Docker container deployment.</w:t>
+      </w:r>
     </w:p>
     <w:p>
       <w:pPr>
@@ -3483,7 +3314,304 @@
           <w:sz w:val="44"/>
           <w:szCs w:val="44"/>
         </w:rPr>
+        <w:t>7.</w:t>
+      </w:r>
+      <w:r>
+        <w:rPr>
+          <w:rFonts w:ascii="Times New Roman" w:eastAsia="Times New Roman" w:hAnsi="Times New Roman" w:cs="Times New Roman"/>
+          <w:b/>
+          <w:bCs/>
+          <w:kern w:val="36"/>
+          <w:sz w:val="44"/>
+          <w:szCs w:val="44"/>
+        </w:rPr>
+        <w:t xml:space="preserve"> Frontend</w:t>
+      </w:r>
+    </w:p>
+    <w:p>
+      <w:pPr>
+        <w:pStyle w:val="NormalWeb"/>
+      </w:pPr>
+      <w:r>
+        <w:t>A lightweight interactive frontend was implemented using Streamlit to improve usability and demonstrate end-user interaction.</w:t>
+      </w:r>
+    </w:p>
+    <w:p>
+      <w:pPr>
+        <w:pStyle w:val="NormalWeb"/>
+      </w:pPr>
+      <w:r>
+        <w:t>The frontend allows users to:</w:t>
+      </w:r>
+    </w:p>
+    <w:p>
+      <w:pPr>
+        <w:numPr>
+          <w:ilvl w:val="0"/>
+          <w:numId w:val="17"/>
+        </w:numPr>
+        <w:spacing w:before="100" w:beforeAutospacing="1" w:after="100" w:afterAutospacing="1" w:line="240" w:lineRule="auto"/>
+        <w:rPr>
+          <w:rFonts w:ascii="Times New Roman" w:hAnsi="Times New Roman" w:cs="Times New Roman"/>
+          <w:sz w:val="24"/>
+          <w:szCs w:val="24"/>
+        </w:rPr>
+      </w:pPr>
+      <w:r>
+        <w:rPr>
+          <w:rFonts w:ascii="Times New Roman" w:hAnsi="Times New Roman" w:cs="Times New Roman"/>
+          <w:sz w:val="24"/>
+          <w:szCs w:val="24"/>
+        </w:rPr>
+        <w:t xml:space="preserve">enter customer details through a simple form, </w:t>
+      </w:r>
+    </w:p>
+    <w:p>
+      <w:pPr>
+        <w:numPr>
+          <w:ilvl w:val="0"/>
+          <w:numId w:val="17"/>
+        </w:numPr>
+        <w:spacing w:before="100" w:beforeAutospacing="1" w:after="100" w:afterAutospacing="1" w:line="240" w:lineRule="auto"/>
+        <w:rPr>
+          <w:rFonts w:ascii="Times New Roman" w:hAnsi="Times New Roman" w:cs="Times New Roman"/>
+          <w:sz w:val="24"/>
+          <w:szCs w:val="24"/>
+        </w:rPr>
+      </w:pPr>
+      <w:r>
+        <w:rPr>
+          <w:rFonts w:ascii="Times New Roman" w:hAnsi="Times New Roman" w:cs="Times New Roman"/>
+          <w:sz w:val="24"/>
+          <w:szCs w:val="24"/>
+        </w:rPr>
+        <w:t xml:space="preserve">send data to the FastAPI backend, </w:t>
+      </w:r>
+    </w:p>
+    <w:p>
+      <w:pPr>
+        <w:numPr>
+          <w:ilvl w:val="0"/>
+          <w:numId w:val="17"/>
+        </w:numPr>
+        <w:spacing w:before="100" w:beforeAutospacing="1" w:after="100" w:afterAutospacing="1" w:line="240" w:lineRule="auto"/>
+        <w:rPr>
+          <w:rFonts w:ascii="Times New Roman" w:hAnsi="Times New Roman" w:cs="Times New Roman"/>
+          <w:sz w:val="24"/>
+          <w:szCs w:val="24"/>
+        </w:rPr>
+      </w:pPr>
+      <w:r>
+        <w:rPr>
+          <w:rFonts w:ascii="Times New Roman" w:hAnsi="Times New Roman" w:cs="Times New Roman"/>
+          <w:sz w:val="24"/>
+          <w:szCs w:val="24"/>
+        </w:rPr>
+        <w:t xml:space="preserve">receive real-time churn predictions. </w:t>
+      </w:r>
+    </w:p>
+    <w:p>
+      <w:pPr>
+        <w:pStyle w:val="NormalWeb"/>
+      </w:pPr>
+      <w:r>
+        <w:t xml:space="preserve">The frontend communicates with the deployed FastAPI API through the </w:t>
+      </w:r>
+      <w:r>
+        <w:rPr>
+          <w:rStyle w:val="HTMLCode"/>
+          <w:rFonts w:ascii="Times New Roman" w:hAnsi="Times New Roman" w:cs="Times New Roman"/>
+          <w:sz w:val="24"/>
+          <w:szCs w:val="24"/>
+        </w:rPr>
+        <w:t>/predict</w:t>
+      </w:r>
+      <w:r>
+        <w:t xml:space="preserve"> endpoint.</w:t>
+      </w:r>
+    </w:p>
+    <w:p>
+      <w:pPr>
+        <w:pStyle w:val="NormalWeb"/>
+        <w:jc w:val="center"/>
+      </w:pPr>
+      <w:r>
+        <w:rPr>
+          <w:noProof/>
+        </w:rPr>
+        <w:drawing>
+          <wp:inline distT="0" distB="0" distL="0" distR="0" wp14:anchorId="1F469FC9" wp14:editId="421A64F1">
+            <wp:extent cx="5637475" cy="2814320"/>
+            <wp:effectExtent l="0" t="0" r="1905" b="5080"/>
+            <wp:docPr id="1" name="Picture 1"/>
+            <wp:cNvGraphicFramePr>
+              <a:graphicFrameLocks xmlns:a="http://schemas.openxmlformats.org/drawingml/2006/main" noChangeAspect="1"/>
+            </wp:cNvGraphicFramePr>
+            <a:graphic xmlns:a="http://schemas.openxmlformats.org/drawingml/2006/main">
+              <a:graphicData uri="http://schemas.openxmlformats.org/drawingml/2006/picture">
+                <pic:pic xmlns:pic="http://schemas.openxmlformats.org/drawingml/2006/picture">
+                  <pic:nvPicPr>
+                    <pic:cNvPr id="1" name=""/>
+                    <pic:cNvPicPr/>
+                  </pic:nvPicPr>
+                  <pic:blipFill>
+                    <a:blip r:embed="rId7"/>
+                    <a:stretch>
+                      <a:fillRect/>
+                    </a:stretch>
+                  </pic:blipFill>
+                  <pic:spPr>
+                    <a:xfrm>
+                      <a:off x="0" y="0"/>
+                      <a:ext cx="5660053" cy="2825591"/>
+                    </a:xfrm>
+                    <a:prstGeom prst="rect">
+                      <a:avLst/>
+                    </a:prstGeom>
+                  </pic:spPr>
+                </pic:pic>
+              </a:graphicData>
+            </a:graphic>
+          </wp:inline>
+        </w:drawing>
+      </w:r>
+    </w:p>
+    <w:p>
+      <w:pPr>
+        <w:pStyle w:val="NormalWeb"/>
+        <w:jc w:val="center"/>
+      </w:pPr>
+      <w:r>
+        <w:t>Figure 4</w:t>
+      </w:r>
+      <w:r>
+        <w:t>: Streamlit frontend used for customer churn prediction.</w:t>
+      </w:r>
+    </w:p>
+    <w:p>
+      <w:pPr>
+        <w:pStyle w:val="Heading3"/>
+        <w:rPr>
+          <w:rFonts w:ascii="Times New Roman" w:hAnsi="Times New Roman" w:cs="Times New Roman"/>
+          <w:color w:val="auto"/>
+        </w:rPr>
+      </w:pPr>
+      <w:r>
+        <w:rPr>
+          <w:rFonts w:ascii="Times New Roman" w:hAnsi="Times New Roman" w:cs="Times New Roman"/>
+          <w:color w:val="auto"/>
+        </w:rPr>
         <w:lastRenderedPageBreak/>
+        <w:t>Why Streamlit:</w:t>
+      </w:r>
+    </w:p>
+    <w:p>
+      <w:pPr>
+        <w:numPr>
+          <w:ilvl w:val="0"/>
+          <w:numId w:val="18"/>
+        </w:numPr>
+        <w:spacing w:before="100" w:beforeAutospacing="1" w:after="100" w:afterAutospacing="1" w:line="240" w:lineRule="auto"/>
+        <w:rPr>
+          <w:rFonts w:ascii="Times New Roman" w:hAnsi="Times New Roman" w:cs="Times New Roman"/>
+          <w:sz w:val="24"/>
+          <w:szCs w:val="24"/>
+        </w:rPr>
+      </w:pPr>
+      <w:r>
+        <w:rPr>
+          <w:rFonts w:ascii="Times New Roman" w:hAnsi="Times New Roman" w:cs="Times New Roman"/>
+          <w:sz w:val="24"/>
+          <w:szCs w:val="24"/>
+        </w:rPr>
+        <w:t xml:space="preserve">simple and fast to develop, </w:t>
+      </w:r>
+    </w:p>
+    <w:p>
+      <w:pPr>
+        <w:numPr>
+          <w:ilvl w:val="0"/>
+          <w:numId w:val="18"/>
+        </w:numPr>
+        <w:spacing w:before="100" w:beforeAutospacing="1" w:after="100" w:afterAutospacing="1" w:line="240" w:lineRule="auto"/>
+        <w:rPr>
+          <w:rFonts w:ascii="Times New Roman" w:hAnsi="Times New Roman" w:cs="Times New Roman"/>
+          <w:sz w:val="24"/>
+          <w:szCs w:val="24"/>
+        </w:rPr>
+      </w:pPr>
+      <w:r>
+        <w:rPr>
+          <w:rFonts w:ascii="Times New Roman" w:hAnsi="Times New Roman" w:cs="Times New Roman"/>
+          <w:sz w:val="24"/>
+          <w:szCs w:val="24"/>
+        </w:rPr>
+        <w:t xml:space="preserve">easy integration with Python APIs, </w:t>
+      </w:r>
+    </w:p>
+    <w:p>
+      <w:pPr>
+        <w:numPr>
+          <w:ilvl w:val="0"/>
+          <w:numId w:val="18"/>
+        </w:numPr>
+        <w:spacing w:before="100" w:beforeAutospacing="1" w:after="100" w:afterAutospacing="1" w:line="240" w:lineRule="auto"/>
+        <w:rPr>
+          <w:rFonts w:ascii="Times New Roman" w:hAnsi="Times New Roman" w:cs="Times New Roman"/>
+          <w:sz w:val="24"/>
+          <w:szCs w:val="24"/>
+        </w:rPr>
+      </w:pPr>
+      <w:r>
+        <w:rPr>
+          <w:rFonts w:ascii="Times New Roman" w:hAnsi="Times New Roman" w:cs="Times New Roman"/>
+          <w:sz w:val="24"/>
+          <w:szCs w:val="24"/>
+        </w:rPr>
+        <w:t xml:space="preserve">suitable for demonstrating machine learning applications. </w:t>
+      </w:r>
+    </w:p>
+    <w:p>
+      <w:pPr>
+        <w:pStyle w:val="NormalWeb"/>
+      </w:pPr>
+      <w:r>
+        <w:t>This frontend improves the accessibility of the system and provides a more realistic deployment scenario.</w:t>
+      </w:r>
+    </w:p>
+    <w:p>
+      <w:pPr>
+        <w:spacing w:before="100" w:beforeAutospacing="1" w:after="100" w:afterAutospacing="1" w:line="240" w:lineRule="auto"/>
+        <w:outlineLvl w:val="0"/>
+        <w:rPr>
+          <w:rFonts w:ascii="Times New Roman" w:eastAsia="Times New Roman" w:hAnsi="Times New Roman" w:cs="Times New Roman"/>
+          <w:sz w:val="24"/>
+          <w:szCs w:val="24"/>
+        </w:rPr>
+      </w:pPr>
+    </w:p>
+    <w:p>
+      <w:pPr>
+        <w:spacing w:before="100" w:beforeAutospacing="1" w:after="100" w:afterAutospacing="1" w:line="240" w:lineRule="auto"/>
+        <w:outlineLvl w:val="0"/>
+        <w:rPr>
+          <w:rFonts w:ascii="Times New Roman" w:eastAsia="Times New Roman" w:hAnsi="Times New Roman" w:cs="Times New Roman"/>
+          <w:b/>
+          <w:bCs/>
+          <w:kern w:val="36"/>
+          <w:sz w:val="44"/>
+          <w:szCs w:val="44"/>
+        </w:rPr>
+      </w:pPr>
+      <w:r>
+        <w:rPr>
+          <w:rFonts w:ascii="Times New Roman" w:eastAsia="Times New Roman" w:hAnsi="Times New Roman" w:cs="Times New Roman"/>
+          <w:b/>
+          <w:bCs/>
+          <w:kern w:val="36"/>
+          <w:sz w:val="44"/>
+          <w:szCs w:val="44"/>
+        </w:rPr>
         <w:t>8. Conclusion</w:t>
       </w:r>
     </w:p>
@@ -3560,6 +3688,9 @@
         </w:rPr>
       </w:pPr>
       <w:r>
+        <w:rPr>
+          <w:rFonts w:ascii="Times New Roman" w:hAnsi="Times New Roman" w:cs="Times New Roman"/>
+        </w:rPr>
         <w:br w:type="page"/>
       </w:r>
     </w:p>
@@ -3567,8 +3698,6 @@
       <w:pPr>
         <w:pStyle w:val="Heading2"/>
       </w:pPr>
-      <w:bookmarkStart w:id="0" w:name="_GoBack"/>
-      <w:bookmarkEnd w:id="0"/>
       <w:r>
         <w:lastRenderedPageBreak/>
         <w:t>References</w:t>
@@ -3665,7 +3794,13 @@
         <w:t>. ACM Computing Surveys, 57(5), Article 129.</w:t>
       </w:r>
     </w:p>
-    <w:p/>
+    <w:p>
+      <w:pPr>
+        <w:rPr>
+          <w:rFonts w:ascii="Times New Roman" w:hAnsi="Times New Roman" w:cs="Times New Roman"/>
+        </w:rPr>
+      </w:pPr>
+    </w:p>
     <w:sectPr>
       <w:pgSz w:w="12240" w:h="15840"/>
       <w:pgMar w:top="1440" w:right="1440" w:bottom="1440" w:left="1440" w:header="720" w:footer="720" w:gutter="0"/>

</xml_diff>

<commit_message>
final sqlite integration and report update
</commit_message>
<xml_diff>
--- a/Anzuman_Ara_MLOps_Report.docx
+++ b/Anzuman_Ara_MLOps_Report.docx
@@ -735,8 +735,6 @@
           <w:szCs w:val="44"/>
         </w:rPr>
       </w:pPr>
-      <w:bookmarkStart w:id="0" w:name="_GoBack"/>
-      <w:bookmarkEnd w:id="0"/>
       <w:r>
         <w:rPr>
           <w:rFonts w:ascii="Times New Roman" w:eastAsia="Times New Roman" w:hAnsi="Times New Roman" w:cs="Times New Roman"/>
@@ -1291,18 +1289,24 @@
           <w:sz w:val="24"/>
           <w:szCs w:val="24"/>
         </w:rPr>
-        <w:t>CSV format is used because the dataset is structured and does not require complex relational queries. This simplifies implementation while still demonstrating the ingestion pipeline.</w:t>
-      </w:r>
-    </w:p>
-    <w:p>
-      <w:pPr>
-        <w:spacing w:after="0" w:line="240" w:lineRule="auto"/>
-        <w:rPr>
-          <w:rFonts w:ascii="Times New Roman" w:eastAsia="Times New Roman" w:hAnsi="Times New Roman" w:cs="Times New Roman"/>
-          <w:sz w:val="24"/>
-          <w:szCs w:val="24"/>
-        </w:rPr>
-      </w:pPr>
+        <w:t>To support structured storage and improve reproducibility, SQLite was used as a lightweight relational database. Historical customer data and new incoming customer data were stored in separate database tables.</w:t>
+      </w:r>
+      <w:r>
+        <w:rPr>
+          <w:rFonts w:ascii="Times New Roman" w:eastAsia="Times New Roman" w:hAnsi="Times New Roman" w:cs="Times New Roman"/>
+          <w:sz w:val="24"/>
+          <w:szCs w:val="24"/>
+        </w:rPr>
+        <w:t xml:space="preserve"> </w:t>
+      </w:r>
+      <w:r>
+        <w:rPr>
+          <w:rFonts w:ascii="Times New Roman" w:eastAsia="Times New Roman" w:hAnsi="Times New Roman" w:cs="Times New Roman"/>
+          <w:sz w:val="24"/>
+          <w:szCs w:val="24"/>
+        </w:rPr>
+        <w:t>The ingestion pipeline reads the new incoming data from the database and merges it into the historical customer dataset. Each ingestion step is logged to track updates over time.</w:t>
+      </w:r>
     </w:p>
     <w:p>
       <w:pPr>
@@ -1342,7 +1346,59 @@
           <w:sz w:val="24"/>
           <w:szCs w:val="24"/>
         </w:rPr>
-        <w:t>The preprocessing stage ensures consistency between training and inference. The following steps are applied:</w:t>
+        <w:t xml:space="preserve">The preprocessing stage ensures consistency between training and inference. </w:t>
+      </w:r>
+      <w:r>
+        <w:rPr>
+          <w:rFonts w:ascii="Times New Roman" w:eastAsia="Times New Roman" w:hAnsi="Times New Roman" w:cs="Times New Roman"/>
+          <w:sz w:val="24"/>
+          <w:szCs w:val="24"/>
+        </w:rPr>
+        <w:t>The preprocessing pipeline reads customer data directly from the SQLite database</w:t>
+      </w:r>
+      <w:r>
+        <w:rPr>
+          <w:rFonts w:ascii="Times New Roman" w:eastAsia="Times New Roman" w:hAnsi="Times New Roman" w:cs="Times New Roman"/>
+          <w:sz w:val="24"/>
+          <w:szCs w:val="24"/>
+        </w:rPr>
+        <w:t>, then applies</w:t>
+      </w:r>
+      <w:r>
+        <w:rPr>
+          <w:rFonts w:ascii="Times New Roman" w:eastAsia="Times New Roman" w:hAnsi="Times New Roman" w:cs="Times New Roman"/>
+          <w:sz w:val="24"/>
+          <w:szCs w:val="24"/>
+        </w:rPr>
+        <w:t xml:space="preserve"> cleaning, encoding, and feature engineering </w:t>
+      </w:r>
+      <w:proofErr w:type="spellStart"/>
+      <w:proofErr w:type="gramStart"/>
+      <w:r>
+        <w:rPr>
+          <w:rFonts w:ascii="Times New Roman" w:eastAsia="Times New Roman" w:hAnsi="Times New Roman" w:cs="Times New Roman"/>
+          <w:sz w:val="24"/>
+          <w:szCs w:val="24"/>
+        </w:rPr>
+        <w:t>steps.</w:t>
+      </w:r>
+      <w:r>
+        <w:rPr>
+          <w:rFonts w:ascii="Times New Roman" w:eastAsia="Times New Roman" w:hAnsi="Times New Roman" w:cs="Times New Roman"/>
+          <w:sz w:val="24"/>
+          <w:szCs w:val="24"/>
+        </w:rPr>
+        <w:t>The</w:t>
+      </w:r>
+      <w:proofErr w:type="spellEnd"/>
+      <w:proofErr w:type="gramEnd"/>
+      <w:r>
+        <w:rPr>
+          <w:rFonts w:ascii="Times New Roman" w:eastAsia="Times New Roman" w:hAnsi="Times New Roman" w:cs="Times New Roman"/>
+          <w:sz w:val="24"/>
+          <w:szCs w:val="24"/>
+        </w:rPr>
+        <w:t xml:space="preserve"> following steps are applied:</w:t>
       </w:r>
     </w:p>
     <w:p>
@@ -1448,6 +1504,40 @@
           <w:sz w:val="24"/>
           <w:szCs w:val="24"/>
         </w:rPr>
+        <w:t xml:space="preserve">SQLite was selected because it is lightweight, easy to integrate with Python, and suitable for small structured datasets. It provides better structured storage than flat files while maintaining simplicity for a student </w:t>
+      </w:r>
+      <w:proofErr w:type="spellStart"/>
+      <w:r>
+        <w:rPr>
+          <w:rFonts w:ascii="Times New Roman" w:eastAsia="Times New Roman" w:hAnsi="Times New Roman" w:cs="Times New Roman"/>
+          <w:sz w:val="24"/>
+          <w:szCs w:val="24"/>
+        </w:rPr>
+        <w:t>MLOps</w:t>
+      </w:r>
+      <w:proofErr w:type="spellEnd"/>
+      <w:r>
+        <w:rPr>
+          <w:rFonts w:ascii="Times New Roman" w:eastAsia="Times New Roman" w:hAnsi="Times New Roman" w:cs="Times New Roman"/>
+          <w:sz w:val="24"/>
+          <w:szCs w:val="24"/>
+        </w:rPr>
+        <w:t xml:space="preserve"> project.</w:t>
+      </w:r>
+      <w:r>
+        <w:rPr>
+          <w:rFonts w:ascii="Times New Roman" w:eastAsia="Times New Roman" w:hAnsi="Times New Roman" w:cs="Times New Roman"/>
+          <w:sz w:val="24"/>
+          <w:szCs w:val="24"/>
+        </w:rPr>
+        <w:t xml:space="preserve"> </w:t>
+      </w:r>
+      <w:r>
+        <w:rPr>
+          <w:rFonts w:ascii="Times New Roman" w:eastAsia="Times New Roman" w:hAnsi="Times New Roman" w:cs="Times New Roman"/>
+          <w:sz w:val="24"/>
+          <w:szCs w:val="24"/>
+        </w:rPr>
         <w:t xml:space="preserve">Consistent preprocessing is critical in </w:t>
       </w:r>
       <w:proofErr w:type="spellStart"/>
@@ -1468,6 +1558,18 @@
         </w:rPr>
         <w:t xml:space="preserve"> systems to avoid training-serving skew.</w:t>
       </w:r>
+    </w:p>
+    <w:p>
+      <w:pPr>
+        <w:spacing w:before="100" w:beforeAutospacing="1" w:after="100" w:afterAutospacing="1" w:line="240" w:lineRule="auto"/>
+        <w:rPr>
+          <w:rFonts w:ascii="Times New Roman" w:eastAsia="Times New Roman" w:hAnsi="Times New Roman" w:cs="Times New Roman"/>
+          <w:sz w:val="24"/>
+          <w:szCs w:val="24"/>
+        </w:rPr>
+      </w:pPr>
+      <w:bookmarkStart w:id="0" w:name="_GoBack"/>
+      <w:bookmarkEnd w:id="0"/>
     </w:p>
     <w:p>
       <w:pPr>
@@ -1529,6 +1631,7 @@
           <w:sz w:val="24"/>
           <w:szCs w:val="24"/>
         </w:rPr>
+        <w:lastRenderedPageBreak/>
         <w:t xml:space="preserve">average monthly value = </w:t>
       </w:r>
       <w:proofErr w:type="spellStart"/>
@@ -1603,7 +1706,6 @@
           <w:sz w:val="36"/>
           <w:szCs w:val="36"/>
         </w:rPr>
-        <w:lastRenderedPageBreak/>
         <w:t>3.4 Model Training</w:t>
       </w:r>
     </w:p>
@@ -1991,6 +2093,7 @@
           <w:sz w:val="24"/>
           <w:szCs w:val="24"/>
         </w:rPr>
+        <w:lastRenderedPageBreak/>
         <w:t>Evaluation is built into the pipeline as an ongoing process rather than being handled as a separate final step. This allows the model’s performance to be checked continuously throughout the workflow, making it easier to detect issues early, maintain reliability, and ensure that the system continues to perform well as new data is introduced.</w:t>
       </w:r>
     </w:p>
@@ -2027,7 +2130,6 @@
           <w:sz w:val="36"/>
           <w:szCs w:val="36"/>
         </w:rPr>
-        <w:lastRenderedPageBreak/>
         <w:t>4.2 Monitoring</w:t>
       </w:r>
     </w:p>
@@ -2116,6 +2218,7 @@
       <w:r>
         <w:rPr>
           <w:rFonts w:ascii="Times New Roman" w:eastAsia="Times New Roman" w:hAnsi="Times New Roman" w:cs="Times New Roman"/>
+          <w:noProof/>
           <w:sz w:val="24"/>
           <w:szCs w:val="24"/>
         </w:rPr>
@@ -2216,6 +2319,14 @@
           <w:szCs w:val="24"/>
         </w:rPr>
         <w:br/>
+      </w:r>
+      <w:r>
+        <w:rPr>
+          <w:rFonts w:ascii="Times New Roman" w:eastAsia="Times New Roman" w:hAnsi="Times New Roman" w:cs="Times New Roman"/>
+          <w:sz w:val="24"/>
+          <w:szCs w:val="24"/>
+        </w:rPr>
+        <w:lastRenderedPageBreak/>
         <w:t>• Detection of anomalies, such as unusual prediction patterns, missing values, or unexpected changes in incoming data.</w:t>
       </w:r>
       <w:r>
@@ -2261,14 +2372,6 @@
           <w:szCs w:val="24"/>
         </w:rPr>
         <w:br/>
-      </w:r>
-      <w:r>
-        <w:rPr>
-          <w:rFonts w:ascii="Times New Roman" w:eastAsia="Times New Roman" w:hAnsi="Times New Roman" w:cs="Times New Roman"/>
-          <w:sz w:val="24"/>
-          <w:szCs w:val="24"/>
-        </w:rPr>
-        <w:lastRenderedPageBreak/>
         <w:t>• Performance degradation alerts can be introduced to notify users when the model’s accuracy or reliability starts to decline.</w:t>
       </w:r>
     </w:p>
@@ -2569,6 +2672,7 @@
           <w:sz w:val="24"/>
           <w:szCs w:val="24"/>
         </w:rPr>
+        <w:lastRenderedPageBreak/>
         <w:t>feature schema (</w:t>
       </w:r>
       <w:proofErr w:type="spellStart"/>
@@ -2702,7 +2806,6 @@
           <w:sz w:val="24"/>
           <w:szCs w:val="24"/>
         </w:rPr>
-        <w:lastRenderedPageBreak/>
         <w:t xml:space="preserve">debugging </w:t>
       </w:r>
     </w:p>
@@ -3019,6 +3122,7 @@
           <w:sz w:val="24"/>
           <w:szCs w:val="24"/>
         </w:rPr>
+        <w:lastRenderedPageBreak/>
         <w:t>The entire system is containerized using Docker.</w:t>
       </w:r>
     </w:p>
@@ -3121,7 +3225,6 @@
           <w:sz w:val="24"/>
           <w:szCs w:val="24"/>
         </w:rPr>
-        <w:lastRenderedPageBreak/>
         <w:t>Why Docker:</w:t>
       </w:r>
     </w:p>
@@ -3439,6 +3542,7 @@
         <w:rPr>
           <w:noProof/>
         </w:rPr>
+        <w:lastRenderedPageBreak/>
         <w:drawing>
           <wp:inline distT="0" distB="0" distL="0" distR="0" wp14:anchorId="1F469FC9" wp14:editId="421A64F1">
             <wp:extent cx="5637475" cy="2814320"/>
@@ -3501,7 +3605,6 @@
           <w:rFonts w:ascii="Times New Roman" w:hAnsi="Times New Roman" w:cs="Times New Roman"/>
           <w:color w:val="auto"/>
         </w:rPr>
-        <w:lastRenderedPageBreak/>
         <w:t>Why Streamlit:</w:t>
       </w:r>
     </w:p>

</xml_diff>